<commit_message>
Correções da especificação para conformidade com o fluxo da tela. Issue #4.
</commit_message>
<xml_diff>
--- a/Requisitos/UC05_ Manter Profissionais.docx
+++ b/Requisitos/UC05_ Manter Profissionais.docx
@@ -620,7 +620,7 @@
                 <w:szCs w:val="28"/>
                 <w:rtl w:val="0"/>
               </w:rPr>
-              <w:t xml:space="preserve">Sistema exibe a lista de categorias já cadastrados contendo filtro de pesquisa disponível (</w:t>
+              <w:t xml:space="preserve">Sistema exibe a lista de profissionais já cadastrados contendo filtro de pesquisa disponível (</w:t>
             </w:r>
             <w:r>
               <w:rPr>
@@ -735,7 +735,24 @@
                 <w:vertAlign w:val="baseline"/>
                 <w:rtl w:val="0"/>
               </w:rPr>
-              <w:t xml:space="preserve">b) Alteração: Ver </w:t>
+              <w:t xml:space="preserve">b) </w:t>
+            </w:r>
+            <w:r>
+              <w:rPr>
+                <w:sz w:val="28"/>
+                <w:szCs w:val="28"/>
+                <w:rtl w:val="0"/>
+              </w:rPr>
+              <w:t xml:space="preserve">Consultar</w:t>
+            </w:r>
+            <w:r>
+              <w:rPr>
+                <w:sz w:val="28"/>
+                <w:szCs w:val="28"/>
+                <w:vertAlign w:val="baseline"/>
+                <w:rtl w:val="0"/>
+              </w:rPr>
+              <w:t xml:space="preserve">: Ver </w:t>
             </w:r>
             <w:r>
               <w:rPr>
@@ -745,7 +762,7 @@
                 <w:vertAlign w:val="baseline"/>
                 <w:rtl w:val="0"/>
               </w:rPr>
-              <w:t xml:space="preserve">Seção Alterar </w:t>
+              <w:t xml:space="preserve">Seção </w:t>
             </w:r>
             <w:r>
               <w:rPr>
@@ -754,31 +771,7 @@
                 <w:szCs w:val="28"/>
                 <w:rtl w:val="0"/>
               </w:rPr>
-              <w:t xml:space="preserve">Profissional</w:t>
-            </w:r>
-            <w:r>
-              <w:rPr>
-                <w:rtl w:val="0"/>
-              </w:rPr>
-            </w:r>
-          </w:p>
-          <w:p>
-            <w:pPr>
-              <w:ind w:left="360" w:firstLine="0"/>
-              <w:rPr>
-                <w:sz w:val="28"/>
-                <w:szCs w:val="28"/>
-                <w:vertAlign w:val="baseline"/>
-              </w:rPr>
-            </w:pPr>
-            <w:r>
-              <w:rPr>
-                <w:sz w:val="28"/>
-                <w:szCs w:val="28"/>
-                <w:vertAlign w:val="baseline"/>
-                <w:rtl w:val="0"/>
-              </w:rPr>
-              <w:t xml:space="preserve">c) Remoção: Ver </w:t>
+              <w:t xml:space="preserve">Consultar</w:t>
             </w:r>
             <w:r>
               <w:rPr>
@@ -788,50 +781,7 @@
                 <w:vertAlign w:val="baseline"/>
                 <w:rtl w:val="0"/>
               </w:rPr>
-              <w:t xml:space="preserve">Seção Remover </w:t>
-            </w:r>
-            <w:r>
-              <w:rPr>
-                <w:color w:val="ff0000"/>
-                <w:sz w:val="28"/>
-                <w:szCs w:val="28"/>
-                <w:rtl w:val="0"/>
-              </w:rPr>
-              <w:t xml:space="preserve">Profissional</w:t>
-            </w:r>
-            <w:r>
-              <w:rPr>
-                <w:rtl w:val="0"/>
-              </w:rPr>
-            </w:r>
-          </w:p>
-          <w:p>
-            <w:pPr>
-              <w:ind w:left="360" w:firstLine="0"/>
-              <w:rPr>
-                <w:sz w:val="28"/>
-                <w:szCs w:val="28"/>
-                <w:vertAlign w:val="baseline"/>
-              </w:rPr>
-            </w:pPr>
-            <w:r>
-              <w:rPr>
-                <w:sz w:val="28"/>
-                <w:szCs w:val="28"/>
-                <w:vertAlign w:val="baseline"/>
-                <w:rtl w:val="0"/>
-              </w:rPr>
-              <w:t xml:space="preserve">d) Consulta: Ver </w:t>
-            </w:r>
-            <w:r>
-              <w:rPr>
-                <w:color w:val="ff0000"/>
-                <w:sz w:val="28"/>
-                <w:szCs w:val="28"/>
-                <w:vertAlign w:val="baseline"/>
-                <w:rtl w:val="0"/>
-              </w:rPr>
-              <w:t xml:space="preserve">Seção Consultar Dados do </w:t>
+              <w:t xml:space="preserve"> </w:t>
             </w:r>
             <w:r>
               <w:rPr>
@@ -1593,7 +1543,7 @@
                 <w:szCs w:val="28"/>
                 <w:rtl w:val="0"/>
               </w:rPr>
-              <w:t xml:space="preserve">1. Ator aciona cancelamento da adição</w:t>
+              <w:t xml:space="preserve">1. Ator aciona cancelamento da inserção.</w:t>
             </w:r>
           </w:p>
           <w:p>
@@ -1898,10 +1848,18 @@
         <w:rPr>
           <w:b w:val="0"/>
           <w:bCs w:val="0"/>
+          <w:rtl w:val="0"/>
+        </w:rPr>
+        <w:t xml:space="preserve">Consultar</w:t>
+      </w:r>
+      <w:r>
+        <w:rPr>
+          <w:b w:val="0"/>
+          <w:bCs w:val="0"/>
           <w:vertAlign w:val="baseline"/>
           <w:rtl w:val="0"/>
         </w:rPr>
-        <w:t xml:space="preserve">Consultar </w:t>
+        <w:t xml:space="preserve"> </w:t>
       </w:r>
       <w:r>
         <w:rPr>
@@ -1997,27 +1955,35 @@
               <w:rPr>
                 <w:sz w:val="28"/>
                 <w:szCs w:val="28"/>
-                <w:vertAlign w:val="baseline"/>
-                <w:rtl w:val="0"/>
-              </w:rPr>
-              <w:t xml:space="preserve">Consulta os dados do </w:t>
-            </w:r>
-            <w:r>
-              <w:rPr>
-                <w:sz w:val="28"/>
-                <w:szCs w:val="28"/>
-                <w:rtl w:val="0"/>
-              </w:rPr>
-              <w:t xml:space="preserve">profissional </w:t>
-            </w:r>
-            <w:r>
-              <w:rPr>
-                <w:sz w:val="28"/>
-                <w:szCs w:val="28"/>
-                <w:vertAlign w:val="baseline"/>
-                <w:rtl w:val="0"/>
-              </w:rPr>
-              <w:t xml:space="preserve">do acervo.</w:t>
+                <w:rtl w:val="0"/>
+              </w:rPr>
+              <w:t xml:space="preserve">Consultar</w:t>
+            </w:r>
+            <w:r>
+              <w:rPr>
+                <w:sz w:val="28"/>
+                <w:szCs w:val="28"/>
+                <w:vertAlign w:val="baseline"/>
+                <w:rtl w:val="0"/>
+              </w:rPr>
+              <w:t xml:space="preserve"> os dados do </w:t>
+            </w:r>
+            <w:r>
+              <w:rPr>
+                <w:sz w:val="28"/>
+                <w:szCs w:val="28"/>
+                <w:rtl w:val="0"/>
+              </w:rPr>
+              <w:t xml:space="preserve">profissional</w:t>
+            </w:r>
+            <w:r>
+              <w:rPr>
+                <w:sz w:val="28"/>
+                <w:szCs w:val="28"/>
+                <w:vertAlign w:val="baseline"/>
+                <w:rtl w:val="0"/>
+              </w:rPr>
+              <w:t xml:space="preserve">.</w:t>
             </w:r>
           </w:p>
         </w:tc>
@@ -2096,21 +2062,7 @@
                 <w:szCs w:val="28"/>
                 <w:rtl w:val="0"/>
               </w:rPr>
-              <w:t xml:space="preserve">olicita ver detalhes sobre o profissional</w:t>
-            </w:r>
-            <w:r>
-              <w:rPr>
-                <w:sz w:val="28"/>
-                <w:szCs w:val="28"/>
-                <w:vertAlign w:val="baseline"/>
-                <w:rtl w:val="0"/>
-              </w:rPr>
-              <w:t xml:space="preserve">.</w:t>
-            </w:r>
-            <w:r>
-              <w:rPr>
-                <w:rtl w:val="0"/>
-              </w:rPr>
+              <w:t xml:space="preserve">olicita para consultar o profissional</w:t>
             </w:r>
           </w:p>
           <w:p>
@@ -2158,7 +2110,7 @@
                 <w:szCs w:val="28"/>
                 <w:rtl w:val="0"/>
               </w:rPr>
-              <w:t xml:space="preserve">Tela_038</w:t>
+              <w:t xml:space="preserve">Tela_021</w:t>
             </w:r>
             <w:r>
               <w:rPr>
@@ -2168,6 +2120,107 @@
                 <w:rtl w:val="0"/>
               </w:rPr>
               <w:t xml:space="preserve">)</w:t>
+            </w:r>
+          </w:p>
+          <w:p>
+            <w:pPr>
+              <w:numPr>
+                <w:ilvl w:val="0"/>
+                <w:numId w:val="1"/>
+              </w:numPr>
+              <w:ind w:left="0" w:firstLine="0"/>
+              <w:rPr>
+                <w:sz w:val="28"/>
+                <w:szCs w:val="28"/>
+                <w:u w:val="none"/>
+              </w:rPr>
+            </w:pPr>
+            <w:r>
+              <w:rPr>
+                <w:sz w:val="28"/>
+                <w:szCs w:val="28"/>
+                <w:rtl w:val="0"/>
+              </w:rPr>
+              <w:t xml:space="preserve">Ator seleciona uma das duas opções disponibilizadas pelo sistema.</w:t>
+            </w:r>
+          </w:p>
+          <w:p>
+            <w:pPr>
+              <w:numPr>
+                <w:ilvl w:val="0"/>
+                <w:numId w:val="1"/>
+              </w:numPr>
+              <w:ind w:left="0" w:firstLine="0"/>
+              <w:rPr>
+                <w:sz w:val="28"/>
+                <w:szCs w:val="28"/>
+                <w:u w:val="none"/>
+              </w:rPr>
+            </w:pPr>
+            <w:r>
+              <w:rPr>
+                <w:sz w:val="28"/>
+                <w:szCs w:val="28"/>
+                <w:rtl w:val="0"/>
+              </w:rPr>
+              <w:t xml:space="preserve">Caso a opção seja:</w:t>
+            </w:r>
+          </w:p>
+          <w:p>
+            <w:pPr>
+              <w:ind w:left="360" w:firstLine="0"/>
+              <w:rPr>
+                <w:sz w:val="28"/>
+                <w:szCs w:val="28"/>
+              </w:rPr>
+            </w:pPr>
+            <w:r>
+              <w:rPr>
+                <w:sz w:val="28"/>
+                <w:szCs w:val="28"/>
+                <w:rtl w:val="0"/>
+              </w:rPr>
+              <w:t xml:space="preserve">a) Remoção: Ver </w:t>
+            </w:r>
+            <w:r>
+              <w:rPr>
+                <w:color w:val="ff0000"/>
+                <w:sz w:val="28"/>
+                <w:szCs w:val="28"/>
+                <w:rtl w:val="0"/>
+              </w:rPr>
+              <w:t xml:space="preserve">Seção Remover Profissional</w:t>
+            </w:r>
+            <w:r>
+              <w:rPr>
+                <w:rtl w:val="0"/>
+              </w:rPr>
+            </w:r>
+          </w:p>
+          <w:p>
+            <w:pPr>
+              <w:ind w:left="360" w:firstLine="0"/>
+              <w:rPr>
+                <w:sz w:val="28"/>
+                <w:szCs w:val="28"/>
+              </w:rPr>
+            </w:pPr>
+            <w:r>
+              <w:rPr>
+                <w:sz w:val="28"/>
+                <w:szCs w:val="28"/>
+                <w:rtl w:val="0"/>
+              </w:rPr>
+              <w:t xml:space="preserve">b) Edição: Ver </w:t>
+            </w:r>
+            <w:r>
+              <w:rPr>
+                <w:color w:val="ff0000"/>
+                <w:sz w:val="28"/>
+                <w:szCs w:val="28"/>
+                <w:rtl w:val="0"/>
+              </w:rPr>
+              <w:t xml:space="preserve">Seção Editar Profissional</w:t>
             </w:r>
             <w:r>
               <w:rPr>
@@ -2255,7 +2308,7 @@
                 <w:szCs w:val="28"/>
                 <w:rtl w:val="0"/>
               </w:rPr>
-              <w:t xml:space="preserve">Ator solicita cancelar. Retorna ao Passo 2 da </w:t>
+              <w:t xml:space="preserve">Ator solicita voltar. Retorna ao Passo 2 da </w:t>
             </w:r>
             <w:r>
               <w:rPr>
@@ -2563,49 +2616,15 @@
                 <w:vertAlign w:val="baseline"/>
                 <w:rtl w:val="0"/>
               </w:rPr>
-              <w:t xml:space="preserve">Sistema exibe a mensagem “Deseja realmente remover </w:t>
-            </w:r>
-            <w:r>
-              <w:rPr>
-                <w:sz w:val="28"/>
-                <w:szCs w:val="28"/>
-                <w:rtl w:val="0"/>
-              </w:rPr>
-              <w:t xml:space="preserve">esse</w:t>
-            </w:r>
-            <w:r>
-              <w:rPr>
-                <w:sz w:val="28"/>
-                <w:szCs w:val="28"/>
-                <w:vertAlign w:val="baseline"/>
-                <w:rtl w:val="0"/>
-              </w:rPr>
-              <w:t xml:space="preserve"> </w:t>
-            </w:r>
-            <w:r>
-              <w:rPr>
-                <w:sz w:val="28"/>
-                <w:szCs w:val="28"/>
-                <w:rtl w:val="0"/>
-              </w:rPr>
-              <w:t xml:space="preserve">profissional</w:t>
-            </w:r>
-            <w:r>
-              <w:rPr>
-                <w:sz w:val="28"/>
-                <w:szCs w:val="28"/>
-                <w:vertAlign w:val="baseline"/>
-                <w:rtl w:val="0"/>
-              </w:rPr>
-              <w:t xml:space="preserve">?</w:t>
-            </w:r>
-            <w:r>
-              <w:rPr>
-                <w:sz w:val="28"/>
-                <w:szCs w:val="28"/>
-                <w:rtl w:val="0"/>
-              </w:rPr>
-              <w:t xml:space="preserve">”</w:t>
+              <w:t xml:space="preserve">Sistema e</w:t>
+            </w:r>
+            <w:r>
+              <w:rPr>
+                <w:sz w:val="28"/>
+                <w:szCs w:val="28"/>
+                <w:rtl w:val="0"/>
+              </w:rPr>
+              <w:t xml:space="preserve">xibe formulário de remoção do profissional</w:t>
             </w:r>
             <w:r>
               <w:rPr>
@@ -2618,8 +2637,28 @@
             </w:r>
             <w:r>
               <w:rPr>
-                <w:rtl w:val="0"/>
-              </w:rPr>
+                <w:sz w:val="28"/>
+                <w:szCs w:val="28"/>
+                <w:rtl w:val="0"/>
+              </w:rPr>
+              <w:t xml:space="preserve">(</w:t>
+            </w:r>
+            <w:r>
+              <w:rPr>
+                <w:color w:val="ff0000"/>
+                <w:sz w:val="28"/>
+                <w:szCs w:val="28"/>
+                <w:rtl w:val="0"/>
+              </w:rPr>
+              <w:t xml:space="preserve">Tela_025</w:t>
+            </w:r>
+            <w:r>
+              <w:rPr>
+                <w:sz w:val="28"/>
+                <w:szCs w:val="28"/>
+                <w:rtl w:val="0"/>
+              </w:rPr>
+              <w:t xml:space="preserve">)</w:t>
             </w:r>
           </w:p>
           <w:p>
@@ -2641,12 +2680,46 @@
                 <w:vertAlign w:val="baseline"/>
                 <w:rtl w:val="0"/>
               </w:rPr>
-              <w:t xml:space="preserve">Ator confirma remoção.</w:t>
-            </w:r>
-            <w:r>
-              <w:rPr>
-                <w:rtl w:val="0"/>
-              </w:rPr>
+              <w:t xml:space="preserve">Ator </w:t>
+            </w:r>
+            <w:r>
+              <w:rPr>
+                <w:sz w:val="28"/>
+                <w:szCs w:val="28"/>
+                <w:rtl w:val="0"/>
+              </w:rPr>
+              <w:t xml:space="preserve">informa o CPF do profissional</w:t>
+            </w:r>
+            <w:r>
+              <w:rPr>
+                <w:sz w:val="28"/>
+                <w:szCs w:val="28"/>
+                <w:vertAlign w:val="baseline"/>
+                <w:rtl w:val="0"/>
+              </w:rPr>
+              <w:t xml:space="preserve">.</w:t>
+            </w:r>
+          </w:p>
+          <w:p>
+            <w:pPr>
+              <w:numPr>
+                <w:ilvl w:val="0"/>
+                <w:numId w:val="2"/>
+              </w:numPr>
+              <w:ind w:left="360" w:hanging="360"/>
+              <w:rPr>
+                <w:sz w:val="28"/>
+                <w:szCs w:val="28"/>
+                <w:u w:val="none"/>
+              </w:rPr>
+            </w:pPr>
+            <w:r>
+              <w:rPr>
+                <w:sz w:val="28"/>
+                <w:szCs w:val="28"/>
+                <w:rtl w:val="0"/>
+              </w:rPr>
+              <w:t xml:space="preserve">Ator marca a ciência da remoção e confirma a remoção do profissional.</w:t>
             </w:r>
           </w:p>
           <w:p>
@@ -2683,6 +2756,37 @@
                 <w:rtl w:val="0"/>
               </w:rPr>
               <w:t xml:space="preserve">do meio persistente.</w:t>
+            </w:r>
+          </w:p>
+          <w:p>
+            <w:pPr>
+              <w:numPr>
+                <w:ilvl w:val="0"/>
+                <w:numId w:val="2"/>
+              </w:numPr>
+              <w:ind w:left="360" w:hanging="360"/>
+              <w:rPr>
+                <w:sz w:val="28"/>
+                <w:szCs w:val="28"/>
+                <w:u w:val="none"/>
+              </w:rPr>
+            </w:pPr>
+            <w:r>
+              <w:rPr>
+                <w:sz w:val="28"/>
+                <w:szCs w:val="28"/>
+                <w:rtl w:val="0"/>
+              </w:rPr>
+              <w:t xml:space="preserve">Sistema retorna ao Passo 2 da </w:t>
+            </w:r>
+            <w:r>
+              <w:rPr>
+                <w:color w:val="ff0000"/>
+                <w:sz w:val="28"/>
+                <w:szCs w:val="28"/>
+                <w:rtl w:val="0"/>
+              </w:rPr>
+              <w:t xml:space="preserve">Seção Principal</w:t>
             </w:r>
             <w:r>
               <w:rPr>
@@ -2764,7 +2868,28 @@
                 <w:vertAlign w:val="baseline"/>
                 <w:rtl w:val="0"/>
               </w:rPr>
-              <w:t xml:space="preserve">Linha 5: </w:t>
+              <w:t xml:space="preserve">Linha </w:t>
+            </w:r>
+            <w:r>
+              <w:rPr>
+                <w:b w:val="1"/>
+                <w:bCs w:val="1"/>
+                <w:sz w:val="28"/>
+                <w:szCs w:val="28"/>
+                <w:rtl w:val="0"/>
+              </w:rPr>
+              <w:t xml:space="preserve">4</w:t>
+            </w:r>
+            <w:r>
+              <w:rPr>
+                <w:b w:val="1"/>
+                <w:bCs w:val="1"/>
+                <w:sz w:val="28"/>
+                <w:szCs w:val="28"/>
+                <w:vertAlign w:val="baseline"/>
+                <w:rtl w:val="0"/>
+              </w:rPr>
+              <w:t xml:space="preserve">: </w:t>
             </w:r>
             <w:r>
               <w:rPr>
@@ -2781,7 +2906,7 @@
                 <w:szCs w:val="28"/>
                 <w:rtl w:val="0"/>
               </w:rPr>
-              <w:t xml:space="preserve">solicita cancelar</w:t>
+              <w:t xml:space="preserve">solicita voltar</w:t>
             </w:r>
             <w:r>
               <w:rPr>
@@ -2817,7 +2942,16 @@
                 <w:vertAlign w:val="baseline"/>
                 <w:rtl w:val="0"/>
               </w:rPr>
-              <w:t xml:space="preserve">Seção Principal</w:t>
+              <w:t xml:space="preserve">Seçã</w:t>
+            </w:r>
+            <w:r>
+              <w:rPr>
+                <w:color w:val="ff0000"/>
+                <w:sz w:val="28"/>
+                <w:szCs w:val="28"/>
+                <w:rtl w:val="0"/>
+              </w:rPr>
+              <w:t xml:space="preserve">o Consultar Profissional</w:t>
             </w:r>
             <w:r>
               <w:rPr>
@@ -2905,7 +3039,17 @@
                 <w:vertAlign w:val="baseline"/>
                 <w:rtl w:val="0"/>
               </w:rPr>
-              <w:t xml:space="preserve">Linha 6</w:t>
+              <w:t xml:space="preserve">Linha </w:t>
+            </w:r>
+            <w:r>
+              <w:rPr>
+                <w:b w:val="1"/>
+                <w:bCs w:val="1"/>
+                <w:sz w:val="28"/>
+                <w:szCs w:val="28"/>
+                <w:rtl w:val="0"/>
+              </w:rPr>
+              <w:t xml:space="preserve">5</w:t>
             </w:r>
             <w:r>
               <w:rPr>
@@ -3412,7 +3556,7 @@
                 <w:szCs w:val="28"/>
                 <w:rtl w:val="0"/>
               </w:rPr>
-              <w:t xml:space="preserve">profissional</w:t>
+              <w:t xml:space="preserve">profissional com possibilidade de edição</w:t>
             </w:r>
             <w:r>
               <w:rPr>
@@ -3430,7 +3574,7 @@
                 <w:szCs w:val="28"/>
                 <w:rtl w:val="0"/>
               </w:rPr>
-              <w:t xml:space="preserve">Tela_039</w:t>
+              <w:t xml:space="preserve">Tela_0XX</w:t>
             </w:r>
             <w:r>
               <w:rPr>
@@ -3687,7 +3831,7 @@
                 <w:szCs w:val="28"/>
                 <w:rtl w:val="0"/>
               </w:rPr>
-              <w:t xml:space="preserve">2.Sistema retorna ao Passo 2 da </w:t>
+              <w:t xml:space="preserve">2. Sistema retorna ao Passo 2 da </w:t>
             </w:r>
             <w:r>
               <w:rPr>
@@ -3696,7 +3840,7 @@
                 <w:szCs w:val="28"/>
                 <w:rtl w:val="0"/>
               </w:rPr>
-              <w:t xml:space="preserve">Seção Principal</w:t>
+              <w:t xml:space="preserve">Seção Consultar Profissioal</w:t>
             </w:r>
             <w:r>
               <w:rPr>
@@ -4069,6 +4213,81 @@
               <w:rPr>
                 <w:rtl w:val="0"/>
               </w:rPr>
+            </w:r>
+          </w:p>
+        </w:tc>
+      </w:tr>
+      <w:tr>
+        <w:trPr>
+          <w:cantSplit w:val="0"/>
+          <w:tblHeader w:val="0"/>
+        </w:trPr>
+        <w:tc>
+          <w:tcPr>
+            <w:tcBorders>
+              <w:top w:color="000000" w:space="0" w:sz="4" w:val="single"/>
+              <w:left w:color="000000" w:space="0" w:sz="4" w:val="single"/>
+              <w:bottom w:color="000000" w:space="0" w:sz="4" w:val="single"/>
+              <w:right w:color="000000" w:space="0" w:sz="4" w:val="single"/>
+            </w:tcBorders>
+            <w:vAlign w:val="top"/>
+          </w:tcPr>
+          <w:p>
+            <w:pPr>
+              <w:jc w:val="center"/>
+              <w:rPr/>
+            </w:pPr>
+            <w:r>
+              <w:rPr>
+                <w:rtl w:val="0"/>
+              </w:rPr>
+              <w:t xml:space="preserve">14/09/2026</w:t>
+            </w:r>
+          </w:p>
+        </w:tc>
+        <w:tc>
+          <w:tcPr>
+            <w:tcBorders>
+              <w:top w:color="000000" w:space="0" w:sz="4" w:val="single"/>
+              <w:left w:color="000000" w:space="0" w:sz="4" w:val="single"/>
+              <w:bottom w:color="000000" w:space="0" w:sz="4" w:val="single"/>
+              <w:right w:color="000000" w:space="0" w:sz="4" w:val="single"/>
+            </w:tcBorders>
+            <w:vAlign w:val="top"/>
+          </w:tcPr>
+          <w:p>
+            <w:pPr>
+              <w:jc w:val="center"/>
+              <w:rPr/>
+            </w:pPr>
+            <w:r>
+              <w:rPr>
+                <w:rtl w:val="0"/>
+              </w:rPr>
+              <w:t xml:space="preserve">Pedro Henrique</w:t>
+            </w:r>
+          </w:p>
+        </w:tc>
+        <w:tc>
+          <w:tcPr>
+            <w:tcBorders>
+              <w:top w:color="000000" w:space="0" w:sz="4" w:val="single"/>
+              <w:left w:color="000000" w:space="0" w:sz="4" w:val="single"/>
+              <w:bottom w:color="000000" w:space="0" w:sz="4" w:val="single"/>
+              <w:right w:color="000000" w:space="0" w:sz="4" w:val="single"/>
+            </w:tcBorders>
+            <w:vAlign w:val="top"/>
+          </w:tcPr>
+          <w:p>
+            <w:pPr>
+              <w:jc w:val="center"/>
+              <w:rPr/>
+            </w:pPr>
+            <w:r>
+              <w:rPr>
+                <w:rtl w:val="0"/>
+              </w:rPr>
+              <w:t xml:space="preserve">Alteração no fluxo conforme modificações nas telas.</w:t>
             </w:r>
           </w:p>
         </w:tc>
@@ -5223,19 +5442,4 @@
   </a:objectDefaults>
   <a:extraClrSchemeLst/>
 </a:theme>
-</file>
-
-<file path=customXML/item1.xml><?xml version="1.0" encoding="utf-8"?>
-<go:gDocsCustomXmlDataStorage xmlns:go="http://customooxmlschemas.google.com/" xmlns:r="http://schemas.openxmlformats.org/officeDocument/2006/relationships" uri="GoogleDocsCustomDataVersion2">
-  <go:docsCustomData xmlns:go="http://customooxmlschemas.google.com/" roundtripDataSignature="AMtx7mhjl/S989pqf/rDktCv2bDrJEpEwA==">CgMxLjA4AHIhMVQ3cFVQVVVKM3FmeFNJYUo3RXZ0TUNDcndqMmN2WDNQ</go:docsCustomData>
-</go:gDocsCustomXmlDataStorage>
-</file>
-
-<file path=customXML/itemProps1.xml><?xml version="1.0" encoding="utf-8"?>
-<ds:datastoreItem xmlns:ds="http://schemas.openxmlformats.org/officeDocument/2006/customXml" ds:itemID="{11111111-1234-1234-1234-123412341234}">
-  <ds:schemaRefs>
-    <ds:schemaRef ds:uri="http://schemas.openxmlformats.org/officeDocument/2006/relationships"/>
-    <ds:schemaRef ds:uri="http://customooxmlschemas.google.com/"/>
-  </ds:schemaRefs>
-</ds:datastoreItem>
 </file>
</xml_diff>

<commit_message>
fix: repara questões ortográficas. Issue #26
</commit_message>
<xml_diff>
--- a/Requisitos/UC05_ Manter Profissionais.docx
+++ b/Requisitos/UC05_ Manter Profissionais.docx
@@ -18,17 +18,7 @@
           <w:sz w:val="36"/>
           <w:szCs w:val="36"/>
         </w:rPr>
-        <w:t>UC05</w:t>
-      </w:r>
-      <w:r>
-        <w:rPr>
-          <w:b/>
-          <w:bCs/>
-          <w:color w:val="FF0000"/>
-          <w:sz w:val="36"/>
-          <w:szCs w:val="36"/>
-        </w:rPr>
-        <w:t xml:space="preserve">: </w:t>
+        <w:t xml:space="preserve">UC05: </w:t>
       </w:r>
       <w:r>
         <w:rPr>
@@ -37,16 +27,7 @@
           <w:sz w:val="36"/>
           <w:szCs w:val="36"/>
         </w:rPr>
-        <w:t xml:space="preserve">Manter </w:t>
-      </w:r>
-      <w:r>
-        <w:rPr>
-          <w:b/>
-          <w:bCs/>
-          <w:sz w:val="36"/>
-          <w:szCs w:val="36"/>
-        </w:rPr>
-        <w:t>Profissionais</w:t>
+        <w:t>Manter Profissionais</w:t>
       </w:r>
     </w:p>
     <w:p>
@@ -565,7 +546,37 @@
                 <w:sz w:val="28"/>
                 <w:szCs w:val="28"/>
               </w:rPr>
-              <w:t xml:space="preserve">Seção Inserir Novo </w:t>
+              <w:t>Seção Inserir Novo Profissional</w:t>
+            </w:r>
+          </w:p>
+          <w:p>
+            <w:pPr>
+              <w:ind w:left="360"/>
+              <w:rPr>
+                <w:sz w:val="28"/>
+                <w:szCs w:val="28"/>
+              </w:rPr>
+            </w:pPr>
+            <w:r>
+              <w:rPr>
+                <w:sz w:val="28"/>
+                <w:szCs w:val="28"/>
+              </w:rPr>
+              <w:t xml:space="preserve">b) </w:t>
+            </w:r>
+            <w:r>
+              <w:rPr>
+                <w:sz w:val="28"/>
+                <w:szCs w:val="28"/>
+              </w:rPr>
+              <w:t>“Acessar”</w:t>
+            </w:r>
+            <w:r>
+              <w:rPr>
+                <w:sz w:val="28"/>
+                <w:szCs w:val="28"/>
+              </w:rPr>
+              <w:t xml:space="preserve">: Ver </w:t>
             </w:r>
             <w:r>
               <w:rPr>
@@ -573,69 +584,7 @@
                 <w:sz w:val="28"/>
                 <w:szCs w:val="28"/>
               </w:rPr>
-              <w:t>Profissional</w:t>
-            </w:r>
-          </w:p>
-          <w:p>
-            <w:pPr>
-              <w:ind w:left="360"/>
-              <w:rPr>
-                <w:sz w:val="28"/>
-                <w:szCs w:val="28"/>
-              </w:rPr>
-            </w:pPr>
-            <w:r>
-              <w:rPr>
-                <w:sz w:val="28"/>
-                <w:szCs w:val="28"/>
-              </w:rPr>
-              <w:t xml:space="preserve">b) </w:t>
-            </w:r>
-            <w:r>
-              <w:rPr>
-                <w:sz w:val="28"/>
-                <w:szCs w:val="28"/>
-              </w:rPr>
-              <w:t>“Acessar”</w:t>
-            </w:r>
-            <w:r>
-              <w:rPr>
-                <w:sz w:val="28"/>
-                <w:szCs w:val="28"/>
-              </w:rPr>
-              <w:t xml:space="preserve">: Ver </w:t>
-            </w:r>
-            <w:r>
-              <w:rPr>
-                <w:color w:val="FF0000"/>
-                <w:sz w:val="28"/>
-                <w:szCs w:val="28"/>
-              </w:rPr>
-              <w:t xml:space="preserve">Seção </w:t>
-            </w:r>
-            <w:r>
-              <w:rPr>
-                <w:color w:val="FF0000"/>
-                <w:sz w:val="28"/>
-                <w:szCs w:val="28"/>
-              </w:rPr>
-              <w:t>Consultar</w:t>
-            </w:r>
-            <w:r>
-              <w:rPr>
-                <w:color w:val="FF0000"/>
-                <w:sz w:val="28"/>
-                <w:szCs w:val="28"/>
-              </w:rPr>
-              <w:t xml:space="preserve"> </w:t>
-            </w:r>
-            <w:r>
-              <w:rPr>
-                <w:color w:val="FF0000"/>
-                <w:sz w:val="28"/>
-                <w:szCs w:val="28"/>
-              </w:rPr>
-              <w:t>Profissional</w:t>
+              <w:t>Seção Consultar Profissional</w:t>
             </w:r>
           </w:p>
           <w:p>
@@ -817,14 +766,7 @@
           <w:b w:val="0"/>
           <w:bCs w:val="0"/>
         </w:rPr>
-        <w:t xml:space="preserve">Inserir Novo </w:t>
-      </w:r>
-      <w:r>
-        <w:rPr>
-          <w:b w:val="0"/>
-          <w:bCs w:val="0"/>
-        </w:rPr>
-        <w:t>Profissional</w:t>
+        <w:t>Inserir Novo Profissional</w:t>
       </w:r>
     </w:p>
     <w:tbl>
@@ -886,21 +828,7 @@
                 <w:sz w:val="28"/>
                 <w:szCs w:val="28"/>
               </w:rPr>
-              <w:t xml:space="preserve">Insere os dados do </w:t>
-            </w:r>
-            <w:r>
-              <w:rPr>
-                <w:sz w:val="28"/>
-                <w:szCs w:val="28"/>
-              </w:rPr>
-              <w:t xml:space="preserve">profissional </w:t>
-            </w:r>
-            <w:r>
-              <w:rPr>
-                <w:sz w:val="28"/>
-                <w:szCs w:val="28"/>
-              </w:rPr>
-              <w:t>em meio persistente.</w:t>
+              <w:t>Insere os dados do profissional em meio persistente.</w:t>
             </w:r>
           </w:p>
         </w:tc>
@@ -995,14 +923,7 @@
                 <w:sz w:val="28"/>
                 <w:szCs w:val="28"/>
               </w:rPr>
-              <w:t xml:space="preserve">Sistema </w:t>
-            </w:r>
-            <w:r>
-              <w:rPr>
-                <w:sz w:val="28"/>
-                <w:szCs w:val="28"/>
-              </w:rPr>
-              <w:t xml:space="preserve">exibe formulário em branco para preenchimento dos dados do profissional (ver </w:t>
+              <w:t xml:space="preserve">Sistema exibe formulário em branco para preenchimento dos dados do profissional (ver </w:t>
             </w:r>
             <w:r>
               <w:rPr>
@@ -1052,14 +973,7 @@
                 <w:sz w:val="28"/>
                 <w:szCs w:val="28"/>
               </w:rPr>
-              <w:t xml:space="preserve">Ator </w:t>
-            </w:r>
-            <w:r>
-              <w:rPr>
-                <w:sz w:val="28"/>
-                <w:szCs w:val="28"/>
-              </w:rPr>
-              <w:t xml:space="preserve">informa os dados e </w:t>
+              <w:t xml:space="preserve">Ator informa os dados e </w:t>
             </w:r>
             <w:r>
               <w:rPr>
@@ -1100,21 +1014,7 @@
                 <w:sz w:val="28"/>
                 <w:szCs w:val="28"/>
               </w:rPr>
-              <w:t xml:space="preserve">Sistema </w:t>
-            </w:r>
-            <w:r>
-              <w:rPr>
-                <w:sz w:val="28"/>
-                <w:szCs w:val="28"/>
-              </w:rPr>
-              <w:t>verifica a validade</w:t>
-            </w:r>
-            <w:r>
-              <w:rPr>
-                <w:sz w:val="28"/>
-                <w:szCs w:val="28"/>
-              </w:rPr>
-              <w:t xml:space="preserve"> dos dados conforme </w:t>
+              <w:t xml:space="preserve">Sistema verifica a validade dos dados conforme </w:t>
             </w:r>
             <w:r>
               <w:rPr>
@@ -1122,15 +1022,7 @@
                 <w:sz w:val="28"/>
                 <w:szCs w:val="28"/>
               </w:rPr>
-              <w:t>DD-</w:t>
-            </w:r>
-            <w:r>
-              <w:rPr>
-                <w:color w:val="FF0000"/>
-                <w:sz w:val="28"/>
-                <w:szCs w:val="28"/>
-              </w:rPr>
-              <w:t>BemMeCare</w:t>
+              <w:t>DD-BemMeCare</w:t>
             </w:r>
             <w:r>
               <w:rPr>
@@ -1358,93 +1250,37 @@
                 <w:sz w:val="28"/>
                 <w:szCs w:val="28"/>
               </w:rPr>
-              <w:t xml:space="preserve">. </w:t>
-            </w:r>
-            <w:r>
-              <w:rPr>
-                <w:sz w:val="28"/>
-                <w:szCs w:val="28"/>
-              </w:rPr>
-              <w:t>CPF inválido</w:t>
-            </w:r>
-            <w:r>
-              <w:rPr>
-                <w:sz w:val="28"/>
-                <w:szCs w:val="28"/>
-              </w:rPr>
-              <w:t xml:space="preserve">. </w:t>
-            </w:r>
-          </w:p>
-          <w:p>
-            <w:pPr>
-              <w:rPr>
-                <w:sz w:val="28"/>
-                <w:szCs w:val="28"/>
-              </w:rPr>
-            </w:pPr>
-            <w:r>
-              <w:rPr>
-                <w:sz w:val="28"/>
-                <w:szCs w:val="28"/>
-              </w:rPr>
-              <w:t>1.</w:t>
-            </w:r>
-            <w:r>
-              <w:rPr>
-                <w:sz w:val="28"/>
-                <w:szCs w:val="28"/>
-              </w:rPr>
-              <w:t>Sistema exibe mensagem “</w:t>
-            </w:r>
-            <w:r>
-              <w:rPr>
-                <w:sz w:val="28"/>
-                <w:szCs w:val="28"/>
-              </w:rPr>
-              <w:t>CPF inválido. Digite novamente.</w:t>
-            </w:r>
-            <w:r>
-              <w:rPr>
-                <w:sz w:val="28"/>
-                <w:szCs w:val="28"/>
-              </w:rPr>
-              <w:t xml:space="preserve">” </w:t>
-            </w:r>
-          </w:p>
-          <w:p>
-            <w:pPr>
-              <w:rPr>
-                <w:sz w:val="28"/>
-                <w:szCs w:val="28"/>
-              </w:rPr>
-            </w:pPr>
-            <w:r>
-              <w:rPr>
-                <w:sz w:val="28"/>
-                <w:szCs w:val="28"/>
-              </w:rPr>
-              <w:t>2.R</w:t>
-            </w:r>
-            <w:r>
-              <w:rPr>
-                <w:sz w:val="28"/>
-                <w:szCs w:val="28"/>
-              </w:rPr>
-              <w:t xml:space="preserve">etornando ao </w:t>
-            </w:r>
-            <w:r>
-              <w:rPr>
-                <w:sz w:val="28"/>
-                <w:szCs w:val="28"/>
-              </w:rPr>
-              <w:t>P</w:t>
-            </w:r>
-            <w:r>
-              <w:rPr>
-                <w:sz w:val="28"/>
-                <w:szCs w:val="28"/>
-              </w:rPr>
-              <w:t>asso 3.</w:t>
+              <w:t xml:space="preserve">. CPF inválido. </w:t>
+            </w:r>
+          </w:p>
+          <w:p>
+            <w:pPr>
+              <w:rPr>
+                <w:sz w:val="28"/>
+                <w:szCs w:val="28"/>
+              </w:rPr>
+            </w:pPr>
+            <w:r>
+              <w:rPr>
+                <w:sz w:val="28"/>
+                <w:szCs w:val="28"/>
+              </w:rPr>
+              <w:t xml:space="preserve">1.Sistema exibe mensagem “CPF inválido. Digite novamente.” </w:t>
+            </w:r>
+          </w:p>
+          <w:p>
+            <w:pPr>
+              <w:rPr>
+                <w:sz w:val="28"/>
+                <w:szCs w:val="28"/>
+              </w:rPr>
+            </w:pPr>
+            <w:r>
+              <w:rPr>
+                <w:sz w:val="28"/>
+                <w:szCs w:val="28"/>
+              </w:rPr>
+              <w:t>2.Retornando ao Passo 3.</w:t>
             </w:r>
           </w:p>
         </w:tc>
@@ -1478,21 +1314,7 @@
           <w:b w:val="0"/>
           <w:bCs w:val="0"/>
         </w:rPr>
-        <w:t>Consultar</w:t>
-      </w:r>
-      <w:r>
-        <w:rPr>
-          <w:b w:val="0"/>
-          <w:bCs w:val="0"/>
-        </w:rPr>
-        <w:t xml:space="preserve"> </w:t>
-      </w:r>
-      <w:r>
-        <w:rPr>
-          <w:b w:val="0"/>
-          <w:bCs w:val="0"/>
-        </w:rPr>
-        <w:t>Profissional</w:t>
+        <w:t>Consultar Profissional</w:t>
       </w:r>
     </w:p>
     <w:tbl>
@@ -1554,28 +1376,7 @@
                 <w:sz w:val="28"/>
                 <w:szCs w:val="28"/>
               </w:rPr>
-              <w:t>Consultar</w:t>
-            </w:r>
-            <w:r>
-              <w:rPr>
-                <w:sz w:val="28"/>
-                <w:szCs w:val="28"/>
-              </w:rPr>
-              <w:t xml:space="preserve"> os dados do </w:t>
-            </w:r>
-            <w:r>
-              <w:rPr>
-                <w:sz w:val="28"/>
-                <w:szCs w:val="28"/>
-              </w:rPr>
-              <w:t>profissional</w:t>
-            </w:r>
-            <w:r>
-              <w:rPr>
-                <w:sz w:val="28"/>
-                <w:szCs w:val="28"/>
-              </w:rPr>
-              <w:t>.</w:t>
+              <w:t>Consultar os dados do profissional.</w:t>
             </w:r>
           </w:p>
         </w:tc>
@@ -1663,21 +1464,7 @@
                 <w:sz w:val="28"/>
                 <w:szCs w:val="28"/>
               </w:rPr>
-              <w:t xml:space="preserve">Sistema exibe todos os dados do </w:t>
-            </w:r>
-            <w:r>
-              <w:rPr>
-                <w:sz w:val="28"/>
-                <w:szCs w:val="28"/>
-              </w:rPr>
-              <w:t>profissional</w:t>
-            </w:r>
-            <w:r>
-              <w:rPr>
-                <w:sz w:val="28"/>
-                <w:szCs w:val="28"/>
-              </w:rPr>
-              <w:t>. (</w:t>
+              <w:t>Sistema exibe todos os dados do profissional. (</w:t>
             </w:r>
             <w:r>
               <w:rPr>
@@ -1755,7 +1542,21 @@
                 <w:sz w:val="28"/>
                 <w:szCs w:val="28"/>
               </w:rPr>
-              <w:t>“Exluir dados”</w:t>
+              <w:t>“Ex</w:t>
+            </w:r>
+            <w:r>
+              <w:rPr>
+                <w:sz w:val="28"/>
+                <w:szCs w:val="28"/>
+              </w:rPr>
+              <w:t>c</w:t>
+            </w:r>
+            <w:r>
+              <w:rPr>
+                <w:sz w:val="28"/>
+                <w:szCs w:val="28"/>
+              </w:rPr>
+              <w:t>luir dados”</w:t>
             </w:r>
             <w:r>
               <w:rPr>
@@ -1920,14 +1721,7 @@
           <w:b w:val="0"/>
           <w:bCs w:val="0"/>
         </w:rPr>
-        <w:t xml:space="preserve">Remover </w:t>
-      </w:r>
-      <w:r>
-        <w:rPr>
-          <w:b w:val="0"/>
-          <w:bCs w:val="0"/>
-        </w:rPr>
-        <w:t>Profissional</w:t>
+        <w:t>Remover Profissional</w:t>
       </w:r>
     </w:p>
     <w:tbl>
@@ -1989,21 +1783,7 @@
                 <w:sz w:val="28"/>
                 <w:szCs w:val="28"/>
               </w:rPr>
-              <w:t xml:space="preserve">Remove dados do </w:t>
-            </w:r>
-            <w:r>
-              <w:rPr>
-                <w:sz w:val="28"/>
-                <w:szCs w:val="28"/>
-              </w:rPr>
-              <w:t xml:space="preserve">profissional </w:t>
-            </w:r>
-            <w:r>
-              <w:rPr>
-                <w:sz w:val="28"/>
-                <w:szCs w:val="28"/>
-              </w:rPr>
-              <w:t>do meio persistente.</w:t>
+              <w:t>Remove dados do profissional do meio persistente.</w:t>
             </w:r>
           </w:p>
         </w:tc>
@@ -2098,28 +1878,7 @@
                 <w:sz w:val="28"/>
                 <w:szCs w:val="28"/>
               </w:rPr>
-              <w:t>Sistema e</w:t>
-            </w:r>
-            <w:r>
-              <w:rPr>
-                <w:sz w:val="28"/>
-                <w:szCs w:val="28"/>
-              </w:rPr>
-              <w:t>xibe formulário de remoção do profissional</w:t>
-            </w:r>
-            <w:r>
-              <w:rPr>
-                <w:sz w:val="28"/>
-                <w:szCs w:val="28"/>
-              </w:rPr>
-              <w:t xml:space="preserve">. </w:t>
-            </w:r>
-            <w:r>
-              <w:rPr>
-                <w:sz w:val="28"/>
-                <w:szCs w:val="28"/>
-              </w:rPr>
-              <w:t>(</w:t>
+              <w:t>Sistema exibe formulário de remoção do profissional. (</w:t>
             </w:r>
             <w:r>
               <w:rPr>
@@ -2154,21 +1913,7 @@
                 <w:sz w:val="28"/>
                 <w:szCs w:val="28"/>
               </w:rPr>
-              <w:t xml:space="preserve">Ator </w:t>
-            </w:r>
-            <w:r>
-              <w:rPr>
-                <w:sz w:val="28"/>
-                <w:szCs w:val="28"/>
-              </w:rPr>
-              <w:t>informa o CPF do profissional</w:t>
-            </w:r>
-            <w:r>
-              <w:rPr>
-                <w:sz w:val="28"/>
-                <w:szCs w:val="28"/>
-              </w:rPr>
-              <w:t>.</w:t>
+              <w:t>Ator informa o CPF do profissional.</w:t>
             </w:r>
           </w:p>
           <w:p>
@@ -2188,14 +1933,7 @@
                 <w:sz w:val="28"/>
                 <w:szCs w:val="28"/>
               </w:rPr>
-              <w:t xml:space="preserve">Ator </w:t>
-            </w:r>
-            <w:r>
-              <w:rPr>
-                <w:sz w:val="28"/>
-                <w:szCs w:val="28"/>
-              </w:rPr>
-              <w:t xml:space="preserve">marca a ciência da remoção e </w:t>
+              <w:t xml:space="preserve">Ator marca a ciência da remoção e </w:t>
             </w:r>
             <w:r>
               <w:rPr>
@@ -2209,7 +1947,21 @@
                 <w:sz w:val="28"/>
                 <w:szCs w:val="28"/>
               </w:rPr>
-              <w:t xml:space="preserve"> “Confirmar”</w:t>
+              <w:t xml:space="preserve"> “</w:t>
+            </w:r>
+            <w:r>
+              <w:rPr>
+                <w:sz w:val="28"/>
+                <w:szCs w:val="28"/>
+              </w:rPr>
+              <w:t>Apagar</w:t>
+            </w:r>
+            <w:r>
+              <w:rPr>
+                <w:sz w:val="28"/>
+                <w:szCs w:val="28"/>
+              </w:rPr>
+              <w:t>”</w:t>
             </w:r>
             <w:r>
               <w:rPr>
@@ -2232,21 +1984,7 @@
                 <w:sz w:val="28"/>
                 <w:szCs w:val="28"/>
               </w:rPr>
-              <w:t xml:space="preserve">Sistema exclui os dados do </w:t>
-            </w:r>
-            <w:r>
-              <w:rPr>
-                <w:sz w:val="28"/>
-                <w:szCs w:val="28"/>
-              </w:rPr>
-              <w:t xml:space="preserve">profissional </w:t>
-            </w:r>
-            <w:r>
-              <w:rPr>
-                <w:sz w:val="28"/>
-                <w:szCs w:val="28"/>
-              </w:rPr>
-              <w:t>do meio persistente.</w:t>
+              <w:t>Sistema exclui os dados do profissional do meio persistente.</w:t>
             </w:r>
           </w:p>
           <w:p>
@@ -2332,60 +2070,14 @@
                 <w:sz w:val="28"/>
                 <w:szCs w:val="28"/>
               </w:rPr>
-              <w:t xml:space="preserve">Linha </w:t>
-            </w:r>
-            <w:r>
-              <w:rPr>
-                <w:b/>
-                <w:bCs/>
-                <w:sz w:val="28"/>
-                <w:szCs w:val="28"/>
-              </w:rPr>
-              <w:t>4</w:t>
-            </w:r>
-            <w:r>
-              <w:rPr>
-                <w:b/>
-                <w:bCs/>
-                <w:sz w:val="28"/>
-                <w:szCs w:val="28"/>
-              </w:rPr>
-              <w:t xml:space="preserve">: </w:t>
-            </w:r>
-            <w:r>
-              <w:rPr>
-                <w:sz w:val="28"/>
-                <w:szCs w:val="28"/>
-              </w:rPr>
-              <w:t xml:space="preserve">Ator </w:t>
-            </w:r>
-            <w:r>
-              <w:rPr>
-                <w:sz w:val="28"/>
-                <w:szCs w:val="28"/>
-              </w:rPr>
-              <w:t>solicita voltar</w:t>
-            </w:r>
-            <w:r>
-              <w:rPr>
-                <w:sz w:val="28"/>
-                <w:szCs w:val="28"/>
-              </w:rPr>
-              <w:t xml:space="preserve">. Retorna ao </w:t>
-            </w:r>
-            <w:r>
-              <w:rPr>
-                <w:sz w:val="28"/>
-                <w:szCs w:val="28"/>
-              </w:rPr>
-              <w:t>P</w:t>
-            </w:r>
-            <w:r>
-              <w:rPr>
-                <w:sz w:val="28"/>
-                <w:szCs w:val="28"/>
-              </w:rPr>
-              <w:t xml:space="preserve">asso 2 da </w:t>
+              <w:t xml:space="preserve">Linha 4: </w:t>
+            </w:r>
+            <w:r>
+              <w:rPr>
+                <w:sz w:val="28"/>
+                <w:szCs w:val="28"/>
+              </w:rPr>
+              <w:t xml:space="preserve">Ator solicita voltar. Retorna ao Passo 2 da </w:t>
             </w:r>
             <w:r>
               <w:rPr>
@@ -2393,15 +2085,7 @@
                 <w:sz w:val="28"/>
                 <w:szCs w:val="28"/>
               </w:rPr>
-              <w:t>Seçã</w:t>
-            </w:r>
-            <w:r>
-              <w:rPr>
-                <w:color w:val="FF0000"/>
-                <w:sz w:val="28"/>
-                <w:szCs w:val="28"/>
-              </w:rPr>
-              <w:t>o Consultar Profissional</w:t>
+              <w:t>Seção Consultar Profissional</w:t>
             </w:r>
             <w:r>
               <w:rPr>
@@ -2465,16 +2149,36 @@
                 <w:sz w:val="28"/>
                 <w:szCs w:val="28"/>
               </w:rPr>
-              <w:t xml:space="preserve">Linha </w:t>
-            </w:r>
-            <w:r>
-              <w:rPr>
-                <w:b/>
-                <w:bCs/>
-                <w:sz w:val="28"/>
-                <w:szCs w:val="28"/>
-              </w:rPr>
-              <w:t>5</w:t>
+              <w:t>Linha 5</w:t>
+            </w:r>
+            <w:r>
+              <w:rPr>
+                <w:sz w:val="28"/>
+                <w:szCs w:val="28"/>
+              </w:rPr>
+              <w:t>. Profissional não pode ser excluído confo</w:t>
+            </w:r>
+            <w:r>
+              <w:rPr>
+                <w:sz w:val="28"/>
+                <w:szCs w:val="28"/>
+              </w:rPr>
+              <w:t>r</w:t>
+            </w:r>
+            <w:r>
+              <w:rPr>
+                <w:sz w:val="28"/>
+                <w:szCs w:val="28"/>
+              </w:rPr>
+              <w:t xml:space="preserve">me </w:t>
+            </w:r>
+            <w:r>
+              <w:rPr>
+                <w:color w:val="FF0000"/>
+                <w:sz w:val="28"/>
+                <w:szCs w:val="28"/>
+              </w:rPr>
+              <w:t>RN01: Exclusão de Profissional</w:t>
             </w:r>
             <w:r>
               <w:rPr>
@@ -2483,19 +2187,35 @@
               </w:rPr>
               <w:t xml:space="preserve">. </w:t>
             </w:r>
-            <w:r>
-              <w:rPr>
-                <w:sz w:val="28"/>
-                <w:szCs w:val="28"/>
-              </w:rPr>
-              <w:t xml:space="preserve">Profissional </w:t>
-            </w:r>
-            <w:r>
-              <w:rPr>
-                <w:sz w:val="28"/>
-                <w:szCs w:val="28"/>
-              </w:rPr>
-              <w:t xml:space="preserve">não pode ser excluído confome </w:t>
+          </w:p>
+          <w:p>
+            <w:pPr>
+              <w:rPr>
+                <w:sz w:val="28"/>
+                <w:szCs w:val="28"/>
+              </w:rPr>
+            </w:pPr>
+            <w:r>
+              <w:rPr>
+                <w:sz w:val="28"/>
+                <w:szCs w:val="28"/>
+              </w:rPr>
+              <w:t xml:space="preserve">1.Sistema exibe mensagem “O profissional não pode ser excluído. Profissional ainda possui agendamentos em aberto.” </w:t>
+            </w:r>
+          </w:p>
+          <w:p>
+            <w:pPr>
+              <w:rPr>
+                <w:sz w:val="28"/>
+                <w:szCs w:val="28"/>
+              </w:rPr>
+            </w:pPr>
+            <w:r>
+              <w:rPr>
+                <w:sz w:val="28"/>
+                <w:szCs w:val="28"/>
+              </w:rPr>
+              <w:t xml:space="preserve">2.Sistema retornando ao Passo 2 da </w:t>
             </w:r>
             <w:r>
               <w:rPr>
@@ -2503,109 +2223,7 @@
                 <w:sz w:val="28"/>
                 <w:szCs w:val="28"/>
               </w:rPr>
-              <w:t>RN01: Exclusão de Profissional</w:t>
-            </w:r>
-            <w:r>
-              <w:rPr>
-                <w:sz w:val="28"/>
-                <w:szCs w:val="28"/>
-              </w:rPr>
-              <w:t xml:space="preserve">. </w:t>
-            </w:r>
-          </w:p>
-          <w:p>
-            <w:pPr>
-              <w:rPr>
-                <w:sz w:val="28"/>
-                <w:szCs w:val="28"/>
-              </w:rPr>
-            </w:pPr>
-            <w:r>
-              <w:rPr>
-                <w:sz w:val="28"/>
-                <w:szCs w:val="28"/>
-              </w:rPr>
-              <w:t>1.</w:t>
-            </w:r>
-            <w:r>
-              <w:rPr>
-                <w:sz w:val="28"/>
-                <w:szCs w:val="28"/>
-              </w:rPr>
-              <w:t xml:space="preserve">Sistema exibe mensagem “O </w:t>
-            </w:r>
-            <w:r>
-              <w:rPr>
-                <w:sz w:val="28"/>
-                <w:szCs w:val="28"/>
-              </w:rPr>
-              <w:t xml:space="preserve">profissional </w:t>
-            </w:r>
-            <w:r>
-              <w:rPr>
-                <w:sz w:val="28"/>
-                <w:szCs w:val="28"/>
-              </w:rPr>
-              <w:t>não pode ser excluído. Pro</w:t>
-            </w:r>
-            <w:r>
-              <w:rPr>
-                <w:sz w:val="28"/>
-                <w:szCs w:val="28"/>
-              </w:rPr>
-              <w:t>fissional ainda possui agendamentos em aberto.</w:t>
-            </w:r>
-            <w:r>
-              <w:rPr>
-                <w:sz w:val="28"/>
-                <w:szCs w:val="28"/>
-              </w:rPr>
-              <w:t>”</w:t>
-            </w:r>
-            <w:r>
-              <w:rPr>
-                <w:sz w:val="28"/>
-                <w:szCs w:val="28"/>
-              </w:rPr>
-              <w:t xml:space="preserve"> </w:t>
-            </w:r>
-          </w:p>
-          <w:p>
-            <w:pPr>
-              <w:rPr>
-                <w:sz w:val="28"/>
-                <w:szCs w:val="28"/>
-              </w:rPr>
-            </w:pPr>
-            <w:r>
-              <w:rPr>
-                <w:sz w:val="28"/>
-                <w:szCs w:val="28"/>
-              </w:rPr>
-              <w:t>2.Sistema r</w:t>
-            </w:r>
-            <w:r>
-              <w:rPr>
-                <w:sz w:val="28"/>
-                <w:szCs w:val="28"/>
-              </w:rPr>
-              <w:t xml:space="preserve">etornando ao Passo 2 da </w:t>
-            </w:r>
-            <w:r>
-              <w:rPr>
-                <w:color w:val="FF0000"/>
-                <w:sz w:val="28"/>
-                <w:szCs w:val="28"/>
-              </w:rPr>
-              <w:t xml:space="preserve">Seção </w:t>
-            </w:r>
-            <w:r>
-              <w:rPr>
-                <w:color w:val="FF0000"/>
-                <w:sz w:val="28"/>
-                <w:szCs w:val="28"/>
-              </w:rPr>
-              <w:t>Principal</w:t>
+              <w:t>Seção Principal</w:t>
             </w:r>
             <w:r>
               <w:rPr>
@@ -2660,14 +2278,7 @@
           <w:b w:val="0"/>
           <w:bCs w:val="0"/>
         </w:rPr>
-        <w:t xml:space="preserve">Alterar Dados do </w:t>
-      </w:r>
-      <w:r>
-        <w:rPr>
-          <w:b w:val="0"/>
-          <w:bCs w:val="0"/>
-        </w:rPr>
-        <w:t>Profissional</w:t>
+        <w:t>Alterar Dados do Profissional</w:t>
       </w:r>
     </w:p>
     <w:tbl>
@@ -2729,28 +2340,7 @@
                 <w:sz w:val="28"/>
                 <w:szCs w:val="28"/>
               </w:rPr>
-              <w:t xml:space="preserve">Altera </w:t>
-            </w:r>
-            <w:r>
-              <w:rPr>
-                <w:sz w:val="28"/>
-                <w:szCs w:val="28"/>
-              </w:rPr>
-              <w:t xml:space="preserve">os dados do </w:t>
-            </w:r>
-            <w:r>
-              <w:rPr>
-                <w:sz w:val="28"/>
-                <w:szCs w:val="28"/>
-              </w:rPr>
-              <w:t xml:space="preserve">profissional </w:t>
-            </w:r>
-            <w:r>
-              <w:rPr>
-                <w:sz w:val="28"/>
-                <w:szCs w:val="28"/>
-              </w:rPr>
-              <w:t>em meio persistente.</w:t>
+              <w:t>Altera os dados do profissional em meio persistente.</w:t>
             </w:r>
           </w:p>
         </w:tc>
@@ -2845,21 +2435,7 @@
                 <w:sz w:val="28"/>
                 <w:szCs w:val="28"/>
               </w:rPr>
-              <w:t xml:space="preserve">Sistema exibe formulário com os dados atuais do </w:t>
-            </w:r>
-            <w:r>
-              <w:rPr>
-                <w:sz w:val="28"/>
-                <w:szCs w:val="28"/>
-              </w:rPr>
-              <w:t>profissional com possibilidade de edição</w:t>
-            </w:r>
-            <w:r>
-              <w:rPr>
-                <w:sz w:val="28"/>
-                <w:szCs w:val="28"/>
-              </w:rPr>
-              <w:t>. (</w:t>
+              <w:t>Sistema exibe formulário com os dados atuais do profissional com possibilidade de edição. (</w:t>
             </w:r>
             <w:r>
               <w:rPr>
@@ -2935,21 +2511,7 @@
                 <w:sz w:val="28"/>
                 <w:szCs w:val="28"/>
               </w:rPr>
-              <w:t xml:space="preserve">Sistema </w:t>
-            </w:r>
-            <w:r>
-              <w:rPr>
-                <w:sz w:val="28"/>
-                <w:szCs w:val="28"/>
-              </w:rPr>
-              <w:t>verifica a validade</w:t>
-            </w:r>
-            <w:r>
-              <w:rPr>
-                <w:sz w:val="28"/>
-                <w:szCs w:val="28"/>
-              </w:rPr>
-              <w:t xml:space="preserve"> dos dados conforme </w:t>
+              <w:t xml:space="preserve">Sistema verifica a validade dos dados conforme </w:t>
             </w:r>
             <w:r>
               <w:rPr>
@@ -2957,15 +2519,7 @@
                 <w:sz w:val="28"/>
                 <w:szCs w:val="28"/>
               </w:rPr>
-              <w:t>DD-B</w:t>
-            </w:r>
-            <w:r>
-              <w:rPr>
-                <w:color w:val="FF0000"/>
-                <w:sz w:val="28"/>
-                <w:szCs w:val="28"/>
-              </w:rPr>
-              <w:t>emMeCare</w:t>
+              <w:t>DD-BemMeCare</w:t>
             </w:r>
             <w:r>
               <w:rPr>
@@ -4580,6 +4134,7 @@
   <w:style w:type="character" w:default="1" w:styleId="Fontepargpadro">
     <w:name w:val="Default Paragraph Font"/>
     <w:uiPriority w:val="1"/>
+    <w:semiHidden/>
     <w:unhideWhenUsed/>
   </w:style>
   <w:style w:type="table" w:default="1" w:styleId="Tabelanormal">

</xml_diff>

<commit_message>
fix: correção dos fluxos seguindo como base as telas atualizadas. Issue #43
Foi criada a seção “Alterar Dados dos Serviços dos Profissionais”, com o objetivo de atualizar as telas referentes aos profissionais.
</commit_message>
<xml_diff>
--- a/Requisitos/UC05_ Manter Profissionais.docx
+++ b/Requisitos/UC05_ Manter Profissionais.docx
@@ -1,6 +1,6 @@
 
 <file path=word/document.xml><?xml version="1.0" encoding="utf-8"?>
-<w:document xmlns:wpc="http://schemas.microsoft.com/office/word/2010/wordprocessingCanvas" xmlns:cx="http://schemas.microsoft.com/office/drawing/2014/chartex" xmlns:cx1="http://schemas.microsoft.com/office/drawing/2015/9/8/chartex" xmlns:cx2="http://schemas.microsoft.com/office/drawing/2015/10/21/chartex" xmlns:cx3="http://schemas.microsoft.com/office/drawing/2016/5/9/chartex" xmlns:cx4="http://schemas.microsoft.com/office/drawing/2016/5/10/chartex" xmlns:cx5="http://schemas.microsoft.com/office/drawing/2016/5/11/chartex" xmlns:cx6="http://schemas.microsoft.com/office/drawing/2016/5/12/chartex" xmlns:cx7="http://schemas.microsoft.com/office/drawing/2016/5/13/chartex" xmlns:cx8="http://schemas.microsoft.com/office/drawing/2016/5/14/chartex" xmlns:mc="http://schemas.openxmlformats.org/markup-compatibility/2006" xmlns:aink="http://schemas.microsoft.com/office/drawing/2016/ink" xmlns:am3d="http://schemas.microsoft.com/office/drawing/2017/model3d" xmlns:o="urn:schemas-microsoft-com:office:office" xmlns:oel="http://schemas.microsoft.com/office/2019/extlst" xmlns:r="http://schemas.openxmlformats.org/officeDocument/2006/relationships" xmlns:m="http://schemas.openxmlformats.org/officeDocument/2006/math" xmlns:v="urn:schemas-microsoft-com:vml" xmlns:wp14="http://schemas.microsoft.com/office/word/2010/wordprocessingDrawing" xmlns:wp="http://schemas.openxmlformats.org/drawingml/2006/wordprocessingDrawing" xmlns:w10="urn:schemas-microsoft-com:office:word" xmlns:w="http://schemas.openxmlformats.org/wordprocessingml/2006/main" xmlns:w14="http://schemas.microsoft.com/office/word/2010/wordml" xmlns:w15="http://schemas.microsoft.com/office/word/2012/wordml" xmlns:w16cex="http://schemas.microsoft.com/office/word/2018/wordml/cex" xmlns:w16cid="http://schemas.microsoft.com/office/word/2016/wordml/cid" xmlns:w16="http://schemas.microsoft.com/office/word/2018/wordml" xmlns:w16du="http://schemas.microsoft.com/office/word/2023/wordml/word16du" xmlns:w16sdtdh="http://schemas.microsoft.com/office/word/2020/wordml/sdtdatahash" xmlns:w16sdtfl="http://schemas.microsoft.com/office/word/2024/wordml/sdtformatlock" xmlns:w16se="http://schemas.microsoft.com/office/word/2015/wordml/symex" xmlns:wpg="http://schemas.microsoft.com/office/word/2010/wordprocessingGroup" xmlns:wpi="http://schemas.microsoft.com/office/word/2010/wordprocessingInk" xmlns:wne="http://schemas.microsoft.com/office/word/2006/wordml" xmlns:wps="http://schemas.microsoft.com/office/word/2010/wordprocessingShape" mc:Ignorable="w14 w15 w16se w16cid w16 w16cex w16sdtdh w16sdtfl w16du wp14">
+<w:document xmlns:wpc="http://schemas.microsoft.com/office/word/2010/wordprocessingCanvas" xmlns:cx="http://schemas.microsoft.com/office/drawing/2014/chartex" xmlns:cx1="http://schemas.microsoft.com/office/drawing/2015/9/8/chartex" xmlns:cx2="http://schemas.microsoft.com/office/drawing/2015/10/21/chartex" xmlns:cx3="http://schemas.microsoft.com/office/drawing/2016/5/9/chartex" xmlns:cx4="http://schemas.microsoft.com/office/drawing/2016/5/10/chartex" xmlns:cx5="http://schemas.microsoft.com/office/drawing/2016/5/11/chartex" xmlns:cx6="http://schemas.microsoft.com/office/drawing/2016/5/12/chartex" xmlns:cx7="http://schemas.microsoft.com/office/drawing/2016/5/13/chartex" xmlns:cx8="http://schemas.microsoft.com/office/drawing/2016/5/14/chartex" xmlns:mc="http://schemas.openxmlformats.org/markup-compatibility/2006" xmlns:aink="http://schemas.microsoft.com/office/drawing/2016/ink" xmlns:am3d="http://schemas.microsoft.com/office/drawing/2017/model3d" xmlns:o="urn:schemas-microsoft-com:office:office" xmlns:r="http://schemas.openxmlformats.org/officeDocument/2006/relationships" xmlns:m="http://schemas.openxmlformats.org/officeDocument/2006/math" xmlns:v="urn:schemas-microsoft-com:vml" xmlns:wp14="http://schemas.microsoft.com/office/word/2010/wordprocessingDrawing" xmlns:wp="http://schemas.openxmlformats.org/drawingml/2006/wordprocessingDrawing" xmlns:w10="urn:schemas-microsoft-com:office:word" xmlns:w="http://schemas.openxmlformats.org/wordprocessingml/2006/main" xmlns:w14="http://schemas.microsoft.com/office/word/2010/wordml" xmlns:w15="http://schemas.microsoft.com/office/word/2012/wordml" xmlns:w16cid="http://schemas.microsoft.com/office/word/2016/wordml/cid" xmlns:w16se="http://schemas.microsoft.com/office/word/2015/wordml/symex" xmlns:wpg="http://schemas.microsoft.com/office/word/2010/wordprocessingGroup" xmlns:wpi="http://schemas.microsoft.com/office/word/2010/wordprocessingInk" xmlns:wne="http://schemas.microsoft.com/office/word/2006/wordml" xmlns:wps="http://schemas.microsoft.com/office/word/2010/wordprocessingShape" mc:Ignorable="w14 w15 w16se w16cid wp14">
   <w:body>
     <w:p>
       <w:pPr>
@@ -297,8 +297,18 @@
                 <w:sz w:val="28"/>
                 <w:szCs w:val="28"/>
               </w:rPr>
-              <w:t>UC01-Autenticar Usuario</w:t>
-            </w:r>
+              <w:t xml:space="preserve">UC01-Autenticar </w:t>
+            </w:r>
+            <w:proofErr w:type="spellStart"/>
+            <w:r>
+              <w:rPr>
+                <w:color w:val="FF0000"/>
+                <w:sz w:val="28"/>
+                <w:szCs w:val="28"/>
+              </w:rPr>
+              <w:t>Usuario</w:t>
+            </w:r>
+            <w:proofErr w:type="spellEnd"/>
             <w:r>
               <w:rPr>
                 <w:sz w:val="28"/>
@@ -668,7 +678,27 @@
                 <w:sz w:val="28"/>
                 <w:szCs w:val="28"/>
               </w:rPr>
-              <w:t xml:space="preserve">Linha 2 : </w:t>
+              <w:t xml:space="preserve">Linha </w:t>
+            </w:r>
+            <w:proofErr w:type="gramStart"/>
+            <w:r>
+              <w:rPr>
+                <w:b/>
+                <w:bCs/>
+                <w:sz w:val="28"/>
+                <w:szCs w:val="28"/>
+              </w:rPr>
+              <w:t>2 :</w:t>
+            </w:r>
+            <w:proofErr w:type="gramEnd"/>
+            <w:r>
+              <w:rPr>
+                <w:b/>
+                <w:bCs/>
+                <w:sz w:val="28"/>
+                <w:szCs w:val="28"/>
+              </w:rPr>
+              <w:t xml:space="preserve"> </w:t>
             </w:r>
             <w:r>
               <w:rPr>
@@ -713,8 +743,18 @@
                 <w:sz w:val="28"/>
                 <w:szCs w:val="28"/>
               </w:rPr>
-              <w:t>DD-BemMeCare</w:t>
-            </w:r>
+              <w:t>DD-</w:t>
+            </w:r>
+            <w:proofErr w:type="spellStart"/>
+            <w:r>
+              <w:rPr>
+                <w:color w:val="FF0000"/>
+                <w:sz w:val="28"/>
+                <w:szCs w:val="28"/>
+              </w:rPr>
+              <w:t>BemMeCare</w:t>
+            </w:r>
+            <w:proofErr w:type="spellEnd"/>
             <w:r>
               <w:rPr>
                 <w:sz w:val="28"/>
@@ -931,8 +971,18 @@
                 <w:sz w:val="28"/>
                 <w:szCs w:val="28"/>
               </w:rPr>
-              <w:t>DD-BemMeCare</w:t>
-            </w:r>
+              <w:t>DD-</w:t>
+            </w:r>
+            <w:proofErr w:type="spellStart"/>
+            <w:r>
+              <w:rPr>
+                <w:color w:val="FF0000"/>
+                <w:sz w:val="28"/>
+                <w:szCs w:val="28"/>
+              </w:rPr>
+              <w:t>BemMeCare</w:t>
+            </w:r>
+            <w:proofErr w:type="spellEnd"/>
             <w:r>
               <w:rPr>
                 <w:sz w:val="28"/>
@@ -1022,8 +1072,18 @@
                 <w:sz w:val="28"/>
                 <w:szCs w:val="28"/>
               </w:rPr>
-              <w:t>DD-BemMeCare</w:t>
-            </w:r>
+              <w:t>DD-</w:t>
+            </w:r>
+            <w:proofErr w:type="spellStart"/>
+            <w:r>
+              <w:rPr>
+                <w:color w:val="FF0000"/>
+                <w:sz w:val="28"/>
+                <w:szCs w:val="28"/>
+              </w:rPr>
+              <w:t>BemMeCare</w:t>
+            </w:r>
+            <w:proofErr w:type="spellEnd"/>
             <w:r>
               <w:rPr>
                 <w:sz w:val="28"/>
@@ -2519,8 +2579,18 @@
                 <w:sz w:val="28"/>
                 <w:szCs w:val="28"/>
               </w:rPr>
-              <w:t>DD-BemMeCare</w:t>
-            </w:r>
+              <w:t>DD-</w:t>
+            </w:r>
+            <w:proofErr w:type="spellStart"/>
+            <w:r>
+              <w:rPr>
+                <w:color w:val="FF0000"/>
+                <w:sz w:val="28"/>
+                <w:szCs w:val="28"/>
+              </w:rPr>
+              <w:t>BemMeCare</w:t>
+            </w:r>
+            <w:proofErr w:type="spellEnd"/>
             <w:r>
               <w:rPr>
                 <w:sz w:val="28"/>
@@ -2614,7 +2684,36 @@
                 <w:sz w:val="28"/>
                 <w:szCs w:val="28"/>
               </w:rPr>
-              <w:t xml:space="preserve">Ator decide cancelar </w:t>
+              <w:t xml:space="preserve">Ator solicita </w:t>
+            </w:r>
+            <w:r>
+              <w:rPr>
+                <w:sz w:val="28"/>
+                <w:szCs w:val="28"/>
+              </w:rPr>
+              <w:t>cancelar</w:t>
+            </w:r>
+            <w:r>
+              <w:rPr>
+                <w:sz w:val="28"/>
+                <w:szCs w:val="28"/>
+              </w:rPr>
+              <w:t xml:space="preserve">. Retorna ao Passo 2 da </w:t>
+            </w:r>
+            <w:r>
+              <w:rPr>
+                <w:color w:val="FF0000"/>
+                <w:sz w:val="28"/>
+                <w:szCs w:val="28"/>
+              </w:rPr>
+              <w:t>Seção Principal</w:t>
+            </w:r>
+            <w:r>
+              <w:rPr>
+                <w:sz w:val="28"/>
+                <w:szCs w:val="28"/>
+              </w:rPr>
+              <w:t>.</w:t>
             </w:r>
           </w:p>
           <w:p>
@@ -2656,7 +2755,23 @@
                 <w:sz w:val="28"/>
                 <w:szCs w:val="28"/>
               </w:rPr>
-              <w:t>Seção Consultar Profissioal</w:t>
+              <w:t>Seção Consultar Profissio</w:t>
+            </w:r>
+            <w:r>
+              <w:rPr>
+                <w:color w:val="FF0000"/>
+                <w:sz w:val="28"/>
+                <w:szCs w:val="28"/>
+              </w:rPr>
+              <w:t>n</w:t>
+            </w:r>
+            <w:r>
+              <w:rPr>
+                <w:color w:val="FF0000"/>
+                <w:sz w:val="28"/>
+                <w:szCs w:val="28"/>
+              </w:rPr>
+              <w:t>al</w:t>
             </w:r>
             <w:r>
               <w:rPr>
@@ -2669,6 +2784,501 @@
         </w:tc>
       </w:tr>
     </w:tbl>
+    <w:p/>
+    <w:p>
+      <w:pPr>
+        <w:pStyle w:val="Ttulo1"/>
+      </w:pPr>
+      <w:r>
+        <w:t xml:space="preserve">Seção: </w:t>
+      </w:r>
+      <w:r>
+        <w:rPr>
+          <w:b w:val="0"/>
+          <w:bCs w:val="0"/>
+        </w:rPr>
+        <w:t>Alterar Dados dos Se</w:t>
+      </w:r>
+      <w:r>
+        <w:rPr>
+          <w:b w:val="0"/>
+          <w:bCs w:val="0"/>
+        </w:rPr>
+        <w:t>rviço</w:t>
+      </w:r>
+      <w:r>
+        <w:rPr>
+          <w:b w:val="0"/>
+          <w:bCs w:val="0"/>
+        </w:rPr>
+        <w:t>s</w:t>
+      </w:r>
+      <w:r>
+        <w:t xml:space="preserve"> </w:t>
+      </w:r>
+      <w:r>
+        <w:rPr>
+          <w:b w:val="0"/>
+          <w:bCs w:val="0"/>
+        </w:rPr>
+        <w:t>do Profissional</w:t>
+      </w:r>
+    </w:p>
+    <w:tbl>
+      <w:tblPr>
+        <w:tblStyle w:val="a3"/>
+        <w:tblW w:w="10330" w:type="dxa"/>
+        <w:tblInd w:w="-70" w:type="dxa"/>
+        <w:tblBorders>
+          <w:top w:val="single" w:sz="4" w:space="0" w:color="000000"/>
+          <w:left w:val="single" w:sz="4" w:space="0" w:color="000000"/>
+          <w:bottom w:val="single" w:sz="4" w:space="0" w:color="000000"/>
+          <w:right w:val="single" w:sz="4" w:space="0" w:color="000000"/>
+          <w:insideH w:val="single" w:sz="4" w:space="0" w:color="000000"/>
+          <w:insideV w:val="single" w:sz="4" w:space="0" w:color="000000"/>
+        </w:tblBorders>
+        <w:tblLayout w:type="fixed"/>
+        <w:tblLook w:val="0000" w:firstRow="0" w:lastRow="0" w:firstColumn="0" w:lastColumn="0" w:noHBand="0" w:noVBand="0"/>
+      </w:tblPr>
+      <w:tblGrid>
+        <w:gridCol w:w="2617"/>
+        <w:gridCol w:w="7713"/>
+      </w:tblGrid>
+      <w:tr>
+        <w:tc>
+          <w:tcPr>
+            <w:tcW w:w="2617" w:type="dxa"/>
+          </w:tcPr>
+          <w:p>
+            <w:pPr>
+              <w:rPr>
+                <w:sz w:val="28"/>
+                <w:szCs w:val="28"/>
+              </w:rPr>
+            </w:pPr>
+            <w:r>
+              <w:rPr>
+                <w:b/>
+                <w:bCs/>
+                <w:sz w:val="28"/>
+                <w:szCs w:val="28"/>
+              </w:rPr>
+              <w:t>Sumário</w:t>
+            </w:r>
+          </w:p>
+        </w:tc>
+        <w:tc>
+          <w:tcPr>
+            <w:tcW w:w="7713" w:type="dxa"/>
+          </w:tcPr>
+          <w:p>
+            <w:pPr>
+              <w:rPr>
+                <w:sz w:val="28"/>
+                <w:szCs w:val="28"/>
+              </w:rPr>
+            </w:pPr>
+            <w:r>
+              <w:rPr>
+                <w:sz w:val="28"/>
+                <w:szCs w:val="28"/>
+              </w:rPr>
+              <w:t>Altera os dados do</w:t>
+            </w:r>
+            <w:r>
+              <w:rPr>
+                <w:sz w:val="28"/>
+                <w:szCs w:val="28"/>
+              </w:rPr>
+              <w:t>s</w:t>
+            </w:r>
+            <w:r>
+              <w:rPr>
+                <w:sz w:val="28"/>
+                <w:szCs w:val="28"/>
+              </w:rPr>
+              <w:t xml:space="preserve"> </w:t>
+            </w:r>
+            <w:r>
+              <w:rPr>
+                <w:sz w:val="28"/>
+                <w:szCs w:val="28"/>
+              </w:rPr>
+              <w:t xml:space="preserve">serviços do </w:t>
+            </w:r>
+            <w:r>
+              <w:rPr>
+                <w:sz w:val="28"/>
+                <w:szCs w:val="28"/>
+              </w:rPr>
+              <w:t>profissional em meio persistente.</w:t>
+            </w:r>
+          </w:p>
+        </w:tc>
+      </w:tr>
+      <w:tr>
+        <w:trPr>
+          <w:cantSplit/>
+        </w:trPr>
+        <w:tc>
+          <w:tcPr>
+            <w:tcW w:w="10330" w:type="dxa"/>
+            <w:gridSpan w:val="2"/>
+          </w:tcPr>
+          <w:p>
+            <w:pPr>
+              <w:pStyle w:val="Ttulo2"/>
+            </w:pPr>
+            <w:r>
+              <w:rPr>
+                <w:b/>
+                <w:bCs/>
+              </w:rPr>
+              <w:t>Fluxo Principal</w:t>
+            </w:r>
+          </w:p>
+        </w:tc>
+      </w:tr>
+      <w:tr>
+        <w:trPr>
+          <w:trHeight w:val="973"/>
+        </w:trPr>
+        <w:tc>
+          <w:tcPr>
+            <w:tcW w:w="10330" w:type="dxa"/>
+            <w:gridSpan w:val="2"/>
+          </w:tcPr>
+          <w:p>
+            <w:pPr>
+              <w:rPr>
+                <w:sz w:val="28"/>
+                <w:szCs w:val="28"/>
+              </w:rPr>
+            </w:pPr>
+            <w:r>
+              <w:rPr>
+                <w:sz w:val="28"/>
+                <w:szCs w:val="28"/>
+              </w:rPr>
+              <w:t>1. Ator clica em “Serviços”</w:t>
+            </w:r>
+          </w:p>
+          <w:p>
+            <w:pPr>
+              <w:rPr>
+                <w:sz w:val="28"/>
+                <w:szCs w:val="28"/>
+              </w:rPr>
+            </w:pPr>
+            <w:r>
+              <w:rPr>
+                <w:sz w:val="28"/>
+                <w:szCs w:val="28"/>
+              </w:rPr>
+              <w:t xml:space="preserve">2. Sistema exibe </w:t>
+            </w:r>
+            <w:r>
+              <w:rPr>
+                <w:sz w:val="28"/>
+                <w:szCs w:val="28"/>
+              </w:rPr>
+              <w:t>os dados dos serviços vinculados ao profissional com possibilidade de edição</w:t>
+            </w:r>
+            <w:r>
+              <w:rPr>
+                <w:sz w:val="28"/>
+                <w:szCs w:val="28"/>
+              </w:rPr>
+              <w:t>. (</w:t>
+            </w:r>
+            <w:r>
+              <w:rPr>
+                <w:color w:val="FF0000"/>
+                <w:sz w:val="28"/>
+                <w:szCs w:val="28"/>
+              </w:rPr>
+              <w:t>Tela_051</w:t>
+            </w:r>
+            <w:r>
+              <w:rPr>
+                <w:sz w:val="28"/>
+                <w:szCs w:val="28"/>
+              </w:rPr>
+              <w:t>).</w:t>
+            </w:r>
+          </w:p>
+          <w:p>
+            <w:pPr>
+              <w:rPr>
+                <w:sz w:val="28"/>
+                <w:szCs w:val="28"/>
+              </w:rPr>
+            </w:pPr>
+            <w:r>
+              <w:rPr>
+                <w:sz w:val="28"/>
+                <w:szCs w:val="28"/>
+              </w:rPr>
+              <w:t>3. Caso a opção seja:</w:t>
+            </w:r>
+          </w:p>
+          <w:p>
+            <w:pPr>
+              <w:rPr>
+                <w:sz w:val="28"/>
+                <w:szCs w:val="28"/>
+              </w:rPr>
+            </w:pPr>
+            <w:r>
+              <w:rPr>
+                <w:sz w:val="28"/>
+                <w:szCs w:val="28"/>
+              </w:rPr>
+              <w:t xml:space="preserve">    </w:t>
+            </w:r>
+            <w:r>
+              <w:rPr>
+                <w:sz w:val="28"/>
+                <w:szCs w:val="28"/>
+              </w:rPr>
+              <w:t xml:space="preserve">a) Ícone de alteração(lápis-Preço): </w:t>
+            </w:r>
+            <w:r>
+              <w:rPr>
+                <w:sz w:val="28"/>
+                <w:szCs w:val="28"/>
+              </w:rPr>
+              <w:t xml:space="preserve">Ator poderá alterar </w:t>
+            </w:r>
+            <w:r>
+              <w:rPr>
+                <w:sz w:val="28"/>
+                <w:szCs w:val="28"/>
+              </w:rPr>
+              <w:t>o preço do serviço em questão.</w:t>
+            </w:r>
+          </w:p>
+          <w:p>
+            <w:pPr>
+              <w:rPr>
+                <w:sz w:val="28"/>
+                <w:szCs w:val="28"/>
+              </w:rPr>
+            </w:pPr>
+            <w:r>
+              <w:rPr>
+                <w:sz w:val="28"/>
+                <w:szCs w:val="28"/>
+              </w:rPr>
+              <w:t xml:space="preserve">    </w:t>
+            </w:r>
+            <w:r>
+              <w:rPr>
+                <w:sz w:val="28"/>
+                <w:szCs w:val="28"/>
+              </w:rPr>
+              <w:t xml:space="preserve">b) Ícone de alteração(lápis-Anamnese): </w:t>
+            </w:r>
+            <w:r>
+              <w:rPr>
+                <w:sz w:val="28"/>
+                <w:szCs w:val="28"/>
+              </w:rPr>
+              <w:t xml:space="preserve">Sistema abre um campo para adicionar outro link de anamnese. </w:t>
+            </w:r>
+            <w:r>
+              <w:rPr>
+                <w:sz w:val="28"/>
+                <w:szCs w:val="28"/>
+              </w:rPr>
+              <w:t>(</w:t>
+            </w:r>
+            <w:r>
+              <w:rPr>
+                <w:color w:val="FF0000"/>
+                <w:sz w:val="28"/>
+                <w:szCs w:val="28"/>
+              </w:rPr>
+              <w:t>Tela_05</w:t>
+            </w:r>
+            <w:r>
+              <w:rPr>
+                <w:color w:val="FF0000"/>
+                <w:sz w:val="28"/>
+                <w:szCs w:val="28"/>
+              </w:rPr>
+              <w:t>2</w:t>
+            </w:r>
+            <w:r>
+              <w:rPr>
+                <w:sz w:val="28"/>
+                <w:szCs w:val="28"/>
+              </w:rPr>
+              <w:t>).</w:t>
+            </w:r>
+          </w:p>
+          <w:p>
+            <w:pPr>
+              <w:rPr>
+                <w:sz w:val="28"/>
+                <w:szCs w:val="28"/>
+              </w:rPr>
+            </w:pPr>
+            <w:r>
+              <w:rPr>
+                <w:sz w:val="28"/>
+                <w:szCs w:val="28"/>
+              </w:rPr>
+              <w:t xml:space="preserve">    </w:t>
+            </w:r>
+            <w:r>
+              <w:rPr>
+                <w:sz w:val="28"/>
+                <w:szCs w:val="28"/>
+              </w:rPr>
+              <w:t>c) Ícone de alteração(lápis-Sinal):</w:t>
+            </w:r>
+            <w:r>
+              <w:rPr>
+                <w:sz w:val="28"/>
+                <w:szCs w:val="28"/>
+              </w:rPr>
+              <w:t xml:space="preserve"> </w:t>
+            </w:r>
+            <w:r>
+              <w:rPr>
+                <w:sz w:val="28"/>
+                <w:szCs w:val="28"/>
+              </w:rPr>
+              <w:t xml:space="preserve">Ator poderá alterar </w:t>
+            </w:r>
+            <w:r>
+              <w:rPr>
+                <w:sz w:val="28"/>
+                <w:szCs w:val="28"/>
+              </w:rPr>
+              <w:t xml:space="preserve">a porcentagem do sinal </w:t>
+            </w:r>
+            <w:r>
+              <w:rPr>
+                <w:sz w:val="28"/>
+                <w:szCs w:val="28"/>
+              </w:rPr>
+              <w:t>do serviço em questão.</w:t>
+            </w:r>
+            <w:bookmarkStart w:id="0" w:name="_GoBack"/>
+            <w:bookmarkEnd w:id="0"/>
+          </w:p>
+        </w:tc>
+      </w:tr>
+      <w:tr>
+        <w:trPr>
+          <w:trHeight w:val="375"/>
+        </w:trPr>
+        <w:tc>
+          <w:tcPr>
+            <w:tcW w:w="10330" w:type="dxa"/>
+            <w:gridSpan w:val="2"/>
+          </w:tcPr>
+          <w:p>
+            <w:pPr>
+              <w:ind w:left="360" w:hanging="360"/>
+              <w:jc w:val="center"/>
+              <w:rPr>
+                <w:b/>
+                <w:bCs/>
+                <w:sz w:val="28"/>
+                <w:szCs w:val="28"/>
+              </w:rPr>
+            </w:pPr>
+            <w:r>
+              <w:rPr>
+                <w:b/>
+                <w:bCs/>
+                <w:sz w:val="28"/>
+                <w:szCs w:val="28"/>
+              </w:rPr>
+              <w:t>Fluxo Alternativo</w:t>
+            </w:r>
+          </w:p>
+        </w:tc>
+      </w:tr>
+      <w:tr>
+        <w:trPr>
+          <w:trHeight w:val="375"/>
+        </w:trPr>
+        <w:tc>
+          <w:tcPr>
+            <w:tcW w:w="10330" w:type="dxa"/>
+            <w:gridSpan w:val="2"/>
+          </w:tcPr>
+          <w:p>
+            <w:pPr>
+              <w:rPr>
+                <w:sz w:val="28"/>
+                <w:szCs w:val="28"/>
+              </w:rPr>
+            </w:pPr>
+            <w:r>
+              <w:rPr>
+                <w:sz w:val="28"/>
+                <w:szCs w:val="28"/>
+              </w:rPr>
+              <w:t>1. Ator clica em “Voltar”.</w:t>
+            </w:r>
+          </w:p>
+          <w:p>
+            <w:pPr>
+              <w:rPr>
+                <w:b/>
+                <w:bCs/>
+                <w:sz w:val="28"/>
+                <w:szCs w:val="28"/>
+              </w:rPr>
+            </w:pPr>
+            <w:r>
+              <w:rPr>
+                <w:sz w:val="28"/>
+                <w:szCs w:val="28"/>
+              </w:rPr>
+              <w:t xml:space="preserve">2. Sistema retorna ao Passo 2 da </w:t>
+            </w:r>
+            <w:r>
+              <w:rPr>
+                <w:color w:val="FF0000"/>
+                <w:sz w:val="28"/>
+                <w:szCs w:val="28"/>
+              </w:rPr>
+              <w:t>Seção Consultar Profissio</w:t>
+            </w:r>
+            <w:r>
+              <w:rPr>
+                <w:color w:val="FF0000"/>
+                <w:sz w:val="28"/>
+                <w:szCs w:val="28"/>
+              </w:rPr>
+              <w:t>n</w:t>
+            </w:r>
+            <w:r>
+              <w:rPr>
+                <w:color w:val="FF0000"/>
+                <w:sz w:val="28"/>
+                <w:szCs w:val="28"/>
+              </w:rPr>
+              <w:t>al</w:t>
+            </w:r>
+            <w:r>
+              <w:rPr>
+                <w:sz w:val="28"/>
+                <w:szCs w:val="28"/>
+              </w:rPr>
+              <w:t>.</w:t>
+            </w:r>
+          </w:p>
+        </w:tc>
+      </w:tr>
+    </w:tbl>
+    <w:p/>
     <w:p/>
     <w:tbl>
       <w:tblPr>
@@ -2999,7 +3609,13 @@
               <w:jc w:val="center"/>
             </w:pPr>
             <w:r>
-              <w:t>Daiane Samtos</w:t>
+              <w:t>Daiane Sa</w:t>
+            </w:r>
+            <w:r>
+              <w:t>n</w:t>
+            </w:r>
+            <w:r>
+              <w:t>tos</w:t>
             </w:r>
           </w:p>
         </w:tc>
@@ -3019,6 +3635,68 @@
             </w:pPr>
             <w:r>
               <w:t>Acrescenta maior fidelidade às telas</w:t>
+            </w:r>
+          </w:p>
+        </w:tc>
+      </w:tr>
+      <w:tr>
+        <w:tc>
+          <w:tcPr>
+            <w:tcW w:w="2628" w:type="dxa"/>
+            <w:tcBorders>
+              <w:top w:val="single" w:sz="4" w:space="0" w:color="000000"/>
+              <w:left w:val="single" w:sz="4" w:space="0" w:color="000000"/>
+              <w:bottom w:val="single" w:sz="4" w:space="0" w:color="000000"/>
+              <w:right w:val="single" w:sz="4" w:space="0" w:color="000000"/>
+            </w:tcBorders>
+          </w:tcPr>
+          <w:p>
+            <w:pPr>
+              <w:jc w:val="center"/>
+            </w:pPr>
+            <w:r>
+              <w:t>15/10/2026</w:t>
+            </w:r>
+          </w:p>
+        </w:tc>
+        <w:tc>
+          <w:tcPr>
+            <w:tcW w:w="1800" w:type="dxa"/>
+            <w:tcBorders>
+              <w:top w:val="single" w:sz="4" w:space="0" w:color="000000"/>
+              <w:left w:val="single" w:sz="4" w:space="0" w:color="000000"/>
+              <w:bottom w:val="single" w:sz="4" w:space="0" w:color="000000"/>
+              <w:right w:val="single" w:sz="4" w:space="0" w:color="000000"/>
+            </w:tcBorders>
+          </w:tcPr>
+          <w:p>
+            <w:pPr>
+              <w:jc w:val="center"/>
+            </w:pPr>
+            <w:r>
+              <w:t>Igor Lemos</w:t>
+            </w:r>
+          </w:p>
+        </w:tc>
+        <w:tc>
+          <w:tcPr>
+            <w:tcW w:w="6120" w:type="dxa"/>
+            <w:tcBorders>
+              <w:top w:val="single" w:sz="4" w:space="0" w:color="000000"/>
+              <w:left w:val="single" w:sz="4" w:space="0" w:color="000000"/>
+              <w:bottom w:val="single" w:sz="4" w:space="0" w:color="000000"/>
+              <w:right w:val="single" w:sz="4" w:space="0" w:color="000000"/>
+            </w:tcBorders>
+          </w:tcPr>
+          <w:p>
+            <w:pPr>
+              <w:jc w:val="center"/>
+            </w:pPr>
+            <w:r>
+              <w:t xml:space="preserve">Adição da seção </w:t>
+            </w:r>
+            <w:r>
+              <w:t>Alterar Dados dos Serviços do Profissional</w:t>
             </w:r>
           </w:p>
         </w:tc>
@@ -3036,7 +3714,7 @@
 </file>
 
 <file path=word/numbering.xml><?xml version="1.0" encoding="utf-8"?>
-<w:numbering xmlns:wpc="http://schemas.microsoft.com/office/word/2010/wordprocessingCanvas" xmlns:cx="http://schemas.microsoft.com/office/drawing/2014/chartex" xmlns:cx1="http://schemas.microsoft.com/office/drawing/2015/9/8/chartex" xmlns:cx2="http://schemas.microsoft.com/office/drawing/2015/10/21/chartex" xmlns:cx3="http://schemas.microsoft.com/office/drawing/2016/5/9/chartex" xmlns:cx4="http://schemas.microsoft.com/office/drawing/2016/5/10/chartex" xmlns:cx5="http://schemas.microsoft.com/office/drawing/2016/5/11/chartex" xmlns:cx6="http://schemas.microsoft.com/office/drawing/2016/5/12/chartex" xmlns:cx7="http://schemas.microsoft.com/office/drawing/2016/5/13/chartex" xmlns:cx8="http://schemas.microsoft.com/office/drawing/2016/5/14/chartex" xmlns:mc="http://schemas.openxmlformats.org/markup-compatibility/2006" xmlns:aink="http://schemas.microsoft.com/office/drawing/2016/ink" xmlns:am3d="http://schemas.microsoft.com/office/drawing/2017/model3d" xmlns:o="urn:schemas-microsoft-com:office:office" xmlns:oel="http://schemas.microsoft.com/office/2019/extlst" xmlns:r="http://schemas.openxmlformats.org/officeDocument/2006/relationships" xmlns:m="http://schemas.openxmlformats.org/officeDocument/2006/math" xmlns:v="urn:schemas-microsoft-com:vml" xmlns:wp14="http://schemas.microsoft.com/office/word/2010/wordprocessingDrawing" xmlns:wp="http://schemas.openxmlformats.org/drawingml/2006/wordprocessingDrawing" xmlns:w10="urn:schemas-microsoft-com:office:word" xmlns:w="http://schemas.openxmlformats.org/wordprocessingml/2006/main" xmlns:w14="http://schemas.microsoft.com/office/word/2010/wordml" xmlns:w15="http://schemas.microsoft.com/office/word/2012/wordml" xmlns:w16cex="http://schemas.microsoft.com/office/word/2018/wordml/cex" xmlns:w16cid="http://schemas.microsoft.com/office/word/2016/wordml/cid" xmlns:w16="http://schemas.microsoft.com/office/word/2018/wordml" xmlns:w16du="http://schemas.microsoft.com/office/word/2023/wordml/word16du" xmlns:w16sdtdh="http://schemas.microsoft.com/office/word/2020/wordml/sdtdatahash" xmlns:w16sdtfl="http://schemas.microsoft.com/office/word/2024/wordml/sdtformatlock" xmlns:w16se="http://schemas.microsoft.com/office/word/2015/wordml/symex" xmlns:wpg="http://schemas.microsoft.com/office/word/2010/wordprocessingGroup" xmlns:wpi="http://schemas.microsoft.com/office/word/2010/wordprocessingInk" xmlns:wne="http://schemas.microsoft.com/office/word/2006/wordml" xmlns:wps="http://schemas.microsoft.com/office/word/2010/wordprocessingShape" mc:Ignorable="w14 w15 w16se w16cid w16 w16cex w16sdtdh w16sdtfl w16du wp14">
+<w:numbering xmlns:wpc="http://schemas.microsoft.com/office/word/2010/wordprocessingCanvas" xmlns:cx="http://schemas.microsoft.com/office/drawing/2014/chartex" xmlns:cx1="http://schemas.microsoft.com/office/drawing/2015/9/8/chartex" xmlns:cx2="http://schemas.microsoft.com/office/drawing/2015/10/21/chartex" xmlns:cx3="http://schemas.microsoft.com/office/drawing/2016/5/9/chartex" xmlns:cx4="http://schemas.microsoft.com/office/drawing/2016/5/10/chartex" xmlns:cx5="http://schemas.microsoft.com/office/drawing/2016/5/11/chartex" xmlns:cx6="http://schemas.microsoft.com/office/drawing/2016/5/12/chartex" xmlns:cx7="http://schemas.microsoft.com/office/drawing/2016/5/13/chartex" xmlns:cx8="http://schemas.microsoft.com/office/drawing/2016/5/14/chartex" xmlns:mc="http://schemas.openxmlformats.org/markup-compatibility/2006" xmlns:aink="http://schemas.microsoft.com/office/drawing/2016/ink" xmlns:am3d="http://schemas.microsoft.com/office/drawing/2017/model3d" xmlns:o="urn:schemas-microsoft-com:office:office" xmlns:r="http://schemas.openxmlformats.org/officeDocument/2006/relationships" xmlns:m="http://schemas.openxmlformats.org/officeDocument/2006/math" xmlns:v="urn:schemas-microsoft-com:vml" xmlns:wp14="http://schemas.microsoft.com/office/word/2010/wordprocessingDrawing" xmlns:wp="http://schemas.openxmlformats.org/drawingml/2006/wordprocessingDrawing" xmlns:w10="urn:schemas-microsoft-com:office:word" xmlns:w="http://schemas.openxmlformats.org/wordprocessingml/2006/main" xmlns:w14="http://schemas.microsoft.com/office/word/2010/wordml" xmlns:w15="http://schemas.microsoft.com/office/word/2012/wordml" xmlns:w16cid="http://schemas.microsoft.com/office/word/2016/wordml/cid" xmlns:w16se="http://schemas.microsoft.com/office/word/2015/wordml/symex" xmlns:wpg="http://schemas.microsoft.com/office/word/2010/wordprocessingGroup" xmlns:wpi="http://schemas.microsoft.com/office/word/2010/wordprocessingInk" xmlns:wne="http://schemas.microsoft.com/office/word/2006/wordml" xmlns:wps="http://schemas.microsoft.com/office/word/2010/wordprocessingShape" mc:Ignorable="w14 w15 w16se w16cid wp14">
   <w:abstractNum w:abstractNumId="0" w15:restartNumberingAfterBreak="0">
     <w:nsid w:val="1E043528"/>
     <w:multiLevelType w:val="multilevel"/>
@@ -3602,26 +4280,26 @@
       </w:rPr>
     </w:lvl>
   </w:abstractNum>
-  <w:num w:numId="1" w16cid:durableId="1151481631">
+  <w:num w:numId="1">
     <w:abstractNumId w:val="3"/>
   </w:num>
-  <w:num w:numId="2" w16cid:durableId="892350855">
+  <w:num w:numId="2">
     <w:abstractNumId w:val="4"/>
   </w:num>
-  <w:num w:numId="3" w16cid:durableId="2061903433">
+  <w:num w:numId="3">
     <w:abstractNumId w:val="1"/>
   </w:num>
-  <w:num w:numId="4" w16cid:durableId="1436831418">
+  <w:num w:numId="4">
     <w:abstractNumId w:val="2"/>
   </w:num>
-  <w:num w:numId="5" w16cid:durableId="147593650">
+  <w:num w:numId="5">
     <w:abstractNumId w:val="0"/>
   </w:num>
 </w:numbering>
 </file>
 
 <file path=word/styles.xml><?xml version="1.0" encoding="utf-8"?>
-<w:styles xmlns:mc="http://schemas.openxmlformats.org/markup-compatibility/2006" xmlns:r="http://schemas.openxmlformats.org/officeDocument/2006/relationships" xmlns:w="http://schemas.openxmlformats.org/wordprocessingml/2006/main" xmlns:w14="http://schemas.microsoft.com/office/word/2010/wordml" xmlns:w15="http://schemas.microsoft.com/office/word/2012/wordml" xmlns:w16cex="http://schemas.microsoft.com/office/word/2018/wordml/cex" xmlns:w16cid="http://schemas.microsoft.com/office/word/2016/wordml/cid" xmlns:w16="http://schemas.microsoft.com/office/word/2018/wordml" xmlns:w16du="http://schemas.microsoft.com/office/word/2023/wordml/word16du" xmlns:w16sdtdh="http://schemas.microsoft.com/office/word/2020/wordml/sdtdatahash" xmlns:w16sdtfl="http://schemas.microsoft.com/office/word/2024/wordml/sdtformatlock" xmlns:w16se="http://schemas.microsoft.com/office/word/2015/wordml/symex" mc:Ignorable="w14 w15 w16se w16cid w16 w16cex w16sdtdh w16sdtfl w16du">
+<w:styles xmlns:mc="http://schemas.openxmlformats.org/markup-compatibility/2006" xmlns:r="http://schemas.openxmlformats.org/officeDocument/2006/relationships" xmlns:w="http://schemas.openxmlformats.org/wordprocessingml/2006/main" xmlns:w14="http://schemas.microsoft.com/office/word/2010/wordml" xmlns:w15="http://schemas.microsoft.com/office/word/2012/wordml" xmlns:w16cid="http://schemas.microsoft.com/office/word/2016/wordml/cid" xmlns:w16se="http://schemas.microsoft.com/office/word/2015/wordml/symex" mc:Ignorable="w14 w15 w16se w16cid">
   <w:docDefaults>
     <w:rPrDefault>
       <w:rPr>
@@ -3633,7 +4311,7 @@
     </w:rPrDefault>
     <w:pPrDefault/>
   </w:docDefaults>
-  <w:latentStyles w:defLockedState="0" w:defUIPriority="99" w:defSemiHidden="0" w:defUnhideWhenUsed="0" w:defQFormat="0" w:count="376">
+  <w:latentStyles w:defLockedState="0" w:defUIPriority="99" w:defSemiHidden="0" w:defUnhideWhenUsed="0" w:defQFormat="0" w:count="375">
     <w:lsdException w:name="Normal" w:uiPriority="0" w:qFormat="1"/>
     <w:lsdException w:name="heading 1" w:uiPriority="9" w:qFormat="1"/>
     <w:lsdException w:name="heading 2" w:semiHidden="1" w:uiPriority="9" w:unhideWhenUsed="1" w:qFormat="1"/>
@@ -4009,11 +4687,11 @@
     <w:lsdException w:name="Smart Hyperlink" w:semiHidden="1" w:unhideWhenUsed="1"/>
     <w:lsdException w:name="Hashtag" w:semiHidden="1" w:unhideWhenUsed="1"/>
     <w:lsdException w:name="Unresolved Mention" w:semiHidden="1" w:unhideWhenUsed="1"/>
-    <w:lsdException w:name="Smart Link" w:semiHidden="1" w:unhideWhenUsed="1"/>
   </w:latentStyles>
   <w:style w:type="paragraph" w:default="1" w:styleId="Normal">
     <w:name w:val="Normal"/>
     <w:qFormat/>
+    <w:rsid w:val="00002BA3"/>
   </w:style>
   <w:style w:type="paragraph" w:styleId="Ttulo1">
     <w:name w:val="heading 1"/>
@@ -4282,6 +4960,24 @@
         <w:right w:w="108" w:type="dxa"/>
       </w:tblCellMar>
     </w:tblPr>
+  </w:style>
+  <w:style w:type="paragraph" w:styleId="PargrafodaLista">
+    <w:name w:val="List Paragraph"/>
+    <w:basedOn w:val="Normal"/>
+    <w:uiPriority w:val="34"/>
+    <w:qFormat/>
+    <w:rsid w:val="00092568"/>
+    <w:pPr>
+      <w:ind w:left="720"/>
+      <w:contextualSpacing/>
+    </w:pPr>
+  </w:style>
+  <w:style w:type="paragraph" w:styleId="Reviso">
+    <w:name w:val="Revision"/>
+    <w:hidden/>
+    <w:uiPriority w:val="99"/>
+    <w:semiHidden/>
+    <w:rsid w:val="00634B97"/>
   </w:style>
 </w:styles>
 </file>

</xml_diff>

<commit_message>
Atualização do caso de uso Manter Profissional. Issue #43
</commit_message>
<xml_diff>
--- a/Requisitos/UC05_ Manter Profissionais.docx
+++ b/Requisitos/UC05_ Manter Profissionais.docx
@@ -1,6 +1,6 @@
 
 <file path=word/document.xml><?xml version="1.0" encoding="utf-8"?>
-<w:document xmlns:wpc="http://schemas.microsoft.com/office/word/2010/wordprocessingCanvas" xmlns:cx="http://schemas.microsoft.com/office/drawing/2014/chartex" xmlns:cx1="http://schemas.microsoft.com/office/drawing/2015/9/8/chartex" xmlns:cx2="http://schemas.microsoft.com/office/drawing/2015/10/21/chartex" xmlns:cx3="http://schemas.microsoft.com/office/drawing/2016/5/9/chartex" xmlns:cx4="http://schemas.microsoft.com/office/drawing/2016/5/10/chartex" xmlns:cx5="http://schemas.microsoft.com/office/drawing/2016/5/11/chartex" xmlns:cx6="http://schemas.microsoft.com/office/drawing/2016/5/12/chartex" xmlns:cx7="http://schemas.microsoft.com/office/drawing/2016/5/13/chartex" xmlns:cx8="http://schemas.microsoft.com/office/drawing/2016/5/14/chartex" xmlns:mc="http://schemas.openxmlformats.org/markup-compatibility/2006" xmlns:aink="http://schemas.microsoft.com/office/drawing/2016/ink" xmlns:am3d="http://schemas.microsoft.com/office/drawing/2017/model3d" xmlns:o="urn:schemas-microsoft-com:office:office" xmlns:r="http://schemas.openxmlformats.org/officeDocument/2006/relationships" xmlns:m="http://schemas.openxmlformats.org/officeDocument/2006/math" xmlns:v="urn:schemas-microsoft-com:vml" xmlns:wp14="http://schemas.microsoft.com/office/word/2010/wordprocessingDrawing" xmlns:wp="http://schemas.openxmlformats.org/drawingml/2006/wordprocessingDrawing" xmlns:w10="urn:schemas-microsoft-com:office:word" xmlns:w="http://schemas.openxmlformats.org/wordprocessingml/2006/main" xmlns:w14="http://schemas.microsoft.com/office/word/2010/wordml" xmlns:w15="http://schemas.microsoft.com/office/word/2012/wordml" xmlns:w16cid="http://schemas.microsoft.com/office/word/2016/wordml/cid" xmlns:w16se="http://schemas.microsoft.com/office/word/2015/wordml/symex" xmlns:wpg="http://schemas.microsoft.com/office/word/2010/wordprocessingGroup" xmlns:wpi="http://schemas.microsoft.com/office/word/2010/wordprocessingInk" xmlns:wne="http://schemas.microsoft.com/office/word/2006/wordml" xmlns:wps="http://schemas.microsoft.com/office/word/2010/wordprocessingShape" mc:Ignorable="w14 w15 w16se w16cid wp14">
+<w:document xmlns:wpc="http://schemas.microsoft.com/office/word/2010/wordprocessingCanvas" xmlns:cx="http://schemas.microsoft.com/office/drawing/2014/chartex" xmlns:cx1="http://schemas.microsoft.com/office/drawing/2015/9/8/chartex" xmlns:cx2="http://schemas.microsoft.com/office/drawing/2015/10/21/chartex" xmlns:cx3="http://schemas.microsoft.com/office/drawing/2016/5/9/chartex" xmlns:cx4="http://schemas.microsoft.com/office/drawing/2016/5/10/chartex" xmlns:cx5="http://schemas.microsoft.com/office/drawing/2016/5/11/chartex" xmlns:cx6="http://schemas.microsoft.com/office/drawing/2016/5/12/chartex" xmlns:cx7="http://schemas.microsoft.com/office/drawing/2016/5/13/chartex" xmlns:cx8="http://schemas.microsoft.com/office/drawing/2016/5/14/chartex" xmlns:mc="http://schemas.openxmlformats.org/markup-compatibility/2006" xmlns:aink="http://schemas.microsoft.com/office/drawing/2016/ink" xmlns:am3d="http://schemas.microsoft.com/office/drawing/2017/model3d" xmlns:o="urn:schemas-microsoft-com:office:office" xmlns:oel="http://schemas.microsoft.com/office/2019/extlst" xmlns:r="http://schemas.openxmlformats.org/officeDocument/2006/relationships" xmlns:m="http://schemas.openxmlformats.org/officeDocument/2006/math" xmlns:v="urn:schemas-microsoft-com:vml" xmlns:wp14="http://schemas.microsoft.com/office/word/2010/wordprocessingDrawing" xmlns:wp="http://schemas.openxmlformats.org/drawingml/2006/wordprocessingDrawing" xmlns:w10="urn:schemas-microsoft-com:office:word" xmlns:w="http://schemas.openxmlformats.org/wordprocessingml/2006/main" xmlns:w14="http://schemas.microsoft.com/office/word/2010/wordml" xmlns:w15="http://schemas.microsoft.com/office/word/2012/wordml" xmlns:w16cex="http://schemas.microsoft.com/office/word/2018/wordml/cex" xmlns:w16cid="http://schemas.microsoft.com/office/word/2016/wordml/cid" xmlns:w16="http://schemas.microsoft.com/office/word/2018/wordml" xmlns:w16du="http://schemas.microsoft.com/office/word/2023/wordml/word16du" xmlns:w16sdtdh="http://schemas.microsoft.com/office/word/2020/wordml/sdtdatahash" xmlns:w16se="http://schemas.microsoft.com/office/word/2015/wordml/symex" xmlns:wpg="http://schemas.microsoft.com/office/word/2010/wordprocessingGroup" xmlns:wpi="http://schemas.microsoft.com/office/word/2010/wordprocessingInk" xmlns:wne="http://schemas.microsoft.com/office/word/2006/wordml" xmlns:wps="http://schemas.microsoft.com/office/word/2010/wordprocessingShape" mc:Ignorable="w14 w15 w16se w16cid w16 w16cex w16sdtdh wp14">
   <w:body>
     <w:p>
       <w:pPr>
@@ -1669,7 +1669,15 @@
                 <w:sz w:val="28"/>
                 <w:szCs w:val="28"/>
               </w:rPr>
-              <w:t>Seção Editar Profissional</w:t>
+              <w:t xml:space="preserve">Seção </w:t>
+            </w:r>
+            <w:r>
+              <w:rPr>
+                <w:color w:val="FF0000"/>
+                <w:sz w:val="28"/>
+                <w:szCs w:val="28"/>
+              </w:rPr>
+              <w:t>Alterar Dados do Profissional</w:t>
             </w:r>
           </w:p>
         </w:tc>
@@ -3084,14 +3092,7 @@
                 <w:sz w:val="28"/>
                 <w:szCs w:val="28"/>
               </w:rPr>
-              <w:t xml:space="preserve">Sistema abre um campo para adicionar outro link de anamnese. </w:t>
-            </w:r>
-            <w:r>
-              <w:rPr>
-                <w:sz w:val="28"/>
-                <w:szCs w:val="28"/>
-              </w:rPr>
-              <w:t>(</w:t>
+              <w:t>Sistema abre um campo para adicionar outro link de anamnese. (</w:t>
             </w:r>
             <w:r>
               <w:rPr>
@@ -3143,31 +3144,8 @@
                 <w:sz w:val="28"/>
                 <w:szCs w:val="28"/>
               </w:rPr>
-              <w:t xml:space="preserve"> </w:t>
-            </w:r>
-            <w:r>
-              <w:rPr>
-                <w:sz w:val="28"/>
-                <w:szCs w:val="28"/>
-              </w:rPr>
-              <w:t xml:space="preserve">Ator poderá alterar </w:t>
-            </w:r>
-            <w:r>
-              <w:rPr>
-                <w:sz w:val="28"/>
-                <w:szCs w:val="28"/>
-              </w:rPr>
-              <w:t xml:space="preserve">a porcentagem do sinal </w:t>
-            </w:r>
-            <w:r>
-              <w:rPr>
-                <w:sz w:val="28"/>
-                <w:szCs w:val="28"/>
-              </w:rPr>
-              <w:t>do serviço em questão.</w:t>
-            </w:r>
-            <w:bookmarkStart w:id="0" w:name="_GoBack"/>
-            <w:bookmarkEnd w:id="0"/>
+              <w:t xml:space="preserve"> Ator poderá alterar a porcentagem do sinal do serviço em questão.</w:t>
+            </w:r>
           </w:p>
         </w:tc>
       </w:tr>
@@ -3714,7 +3692,7 @@
 </file>
 
 <file path=word/numbering.xml><?xml version="1.0" encoding="utf-8"?>
-<w:numbering xmlns:wpc="http://schemas.microsoft.com/office/word/2010/wordprocessingCanvas" xmlns:cx="http://schemas.microsoft.com/office/drawing/2014/chartex" xmlns:cx1="http://schemas.microsoft.com/office/drawing/2015/9/8/chartex" xmlns:cx2="http://schemas.microsoft.com/office/drawing/2015/10/21/chartex" xmlns:cx3="http://schemas.microsoft.com/office/drawing/2016/5/9/chartex" xmlns:cx4="http://schemas.microsoft.com/office/drawing/2016/5/10/chartex" xmlns:cx5="http://schemas.microsoft.com/office/drawing/2016/5/11/chartex" xmlns:cx6="http://schemas.microsoft.com/office/drawing/2016/5/12/chartex" xmlns:cx7="http://schemas.microsoft.com/office/drawing/2016/5/13/chartex" xmlns:cx8="http://schemas.microsoft.com/office/drawing/2016/5/14/chartex" xmlns:mc="http://schemas.openxmlformats.org/markup-compatibility/2006" xmlns:aink="http://schemas.microsoft.com/office/drawing/2016/ink" xmlns:am3d="http://schemas.microsoft.com/office/drawing/2017/model3d" xmlns:o="urn:schemas-microsoft-com:office:office" xmlns:r="http://schemas.openxmlformats.org/officeDocument/2006/relationships" xmlns:m="http://schemas.openxmlformats.org/officeDocument/2006/math" xmlns:v="urn:schemas-microsoft-com:vml" xmlns:wp14="http://schemas.microsoft.com/office/word/2010/wordprocessingDrawing" xmlns:wp="http://schemas.openxmlformats.org/drawingml/2006/wordprocessingDrawing" xmlns:w10="urn:schemas-microsoft-com:office:word" xmlns:w="http://schemas.openxmlformats.org/wordprocessingml/2006/main" xmlns:w14="http://schemas.microsoft.com/office/word/2010/wordml" xmlns:w15="http://schemas.microsoft.com/office/word/2012/wordml" xmlns:w16cid="http://schemas.microsoft.com/office/word/2016/wordml/cid" xmlns:w16se="http://schemas.microsoft.com/office/word/2015/wordml/symex" xmlns:wpg="http://schemas.microsoft.com/office/word/2010/wordprocessingGroup" xmlns:wpi="http://schemas.microsoft.com/office/word/2010/wordprocessingInk" xmlns:wne="http://schemas.microsoft.com/office/word/2006/wordml" xmlns:wps="http://schemas.microsoft.com/office/word/2010/wordprocessingShape" mc:Ignorable="w14 w15 w16se w16cid wp14">
+<w:numbering xmlns:wpc="http://schemas.microsoft.com/office/word/2010/wordprocessingCanvas" xmlns:cx="http://schemas.microsoft.com/office/drawing/2014/chartex" xmlns:cx1="http://schemas.microsoft.com/office/drawing/2015/9/8/chartex" xmlns:cx2="http://schemas.microsoft.com/office/drawing/2015/10/21/chartex" xmlns:cx3="http://schemas.microsoft.com/office/drawing/2016/5/9/chartex" xmlns:cx4="http://schemas.microsoft.com/office/drawing/2016/5/10/chartex" xmlns:cx5="http://schemas.microsoft.com/office/drawing/2016/5/11/chartex" xmlns:cx6="http://schemas.microsoft.com/office/drawing/2016/5/12/chartex" xmlns:cx7="http://schemas.microsoft.com/office/drawing/2016/5/13/chartex" xmlns:cx8="http://schemas.microsoft.com/office/drawing/2016/5/14/chartex" xmlns:mc="http://schemas.openxmlformats.org/markup-compatibility/2006" xmlns:aink="http://schemas.microsoft.com/office/drawing/2016/ink" xmlns:am3d="http://schemas.microsoft.com/office/drawing/2017/model3d" xmlns:o="urn:schemas-microsoft-com:office:office" xmlns:oel="http://schemas.microsoft.com/office/2019/extlst" xmlns:r="http://schemas.openxmlformats.org/officeDocument/2006/relationships" xmlns:m="http://schemas.openxmlformats.org/officeDocument/2006/math" xmlns:v="urn:schemas-microsoft-com:vml" xmlns:wp14="http://schemas.microsoft.com/office/word/2010/wordprocessingDrawing" xmlns:wp="http://schemas.openxmlformats.org/drawingml/2006/wordprocessingDrawing" xmlns:w10="urn:schemas-microsoft-com:office:word" xmlns:w="http://schemas.openxmlformats.org/wordprocessingml/2006/main" xmlns:w14="http://schemas.microsoft.com/office/word/2010/wordml" xmlns:w15="http://schemas.microsoft.com/office/word/2012/wordml" xmlns:w16cex="http://schemas.microsoft.com/office/word/2018/wordml/cex" xmlns:w16cid="http://schemas.microsoft.com/office/word/2016/wordml/cid" xmlns:w16="http://schemas.microsoft.com/office/word/2018/wordml" xmlns:w16du="http://schemas.microsoft.com/office/word/2023/wordml/word16du" xmlns:w16sdtdh="http://schemas.microsoft.com/office/word/2020/wordml/sdtdatahash" xmlns:w16se="http://schemas.microsoft.com/office/word/2015/wordml/symex" xmlns:wpg="http://schemas.microsoft.com/office/word/2010/wordprocessingGroup" xmlns:wpi="http://schemas.microsoft.com/office/word/2010/wordprocessingInk" xmlns:wne="http://schemas.microsoft.com/office/word/2006/wordml" xmlns:wps="http://schemas.microsoft.com/office/word/2010/wordprocessingShape" mc:Ignorable="w14 w15 w16se w16cid w16 w16cex w16sdtdh wp14">
   <w:abstractNum w:abstractNumId="0" w15:restartNumberingAfterBreak="0">
     <w:nsid w:val="1E043528"/>
     <w:multiLevelType w:val="multilevel"/>
@@ -4280,26 +4258,26 @@
       </w:rPr>
     </w:lvl>
   </w:abstractNum>
-  <w:num w:numId="1">
+  <w:num w:numId="1" w16cid:durableId="338195587">
     <w:abstractNumId w:val="3"/>
   </w:num>
-  <w:num w:numId="2">
+  <w:num w:numId="2" w16cid:durableId="900560385">
     <w:abstractNumId w:val="4"/>
   </w:num>
-  <w:num w:numId="3">
+  <w:num w:numId="3" w16cid:durableId="852572182">
     <w:abstractNumId w:val="1"/>
   </w:num>
-  <w:num w:numId="4">
+  <w:num w:numId="4" w16cid:durableId="288171258">
     <w:abstractNumId w:val="2"/>
   </w:num>
-  <w:num w:numId="5">
+  <w:num w:numId="5" w16cid:durableId="384331847">
     <w:abstractNumId w:val="0"/>
   </w:num>
 </w:numbering>
 </file>
 
 <file path=word/styles.xml><?xml version="1.0" encoding="utf-8"?>
-<w:styles xmlns:mc="http://schemas.openxmlformats.org/markup-compatibility/2006" xmlns:r="http://schemas.openxmlformats.org/officeDocument/2006/relationships" xmlns:w="http://schemas.openxmlformats.org/wordprocessingml/2006/main" xmlns:w14="http://schemas.microsoft.com/office/word/2010/wordml" xmlns:w15="http://schemas.microsoft.com/office/word/2012/wordml" xmlns:w16cid="http://schemas.microsoft.com/office/word/2016/wordml/cid" xmlns:w16se="http://schemas.microsoft.com/office/word/2015/wordml/symex" mc:Ignorable="w14 w15 w16se w16cid">
+<w:styles xmlns:mc="http://schemas.openxmlformats.org/markup-compatibility/2006" xmlns:r="http://schemas.openxmlformats.org/officeDocument/2006/relationships" xmlns:w="http://schemas.openxmlformats.org/wordprocessingml/2006/main" xmlns:w14="http://schemas.microsoft.com/office/word/2010/wordml" xmlns:w15="http://schemas.microsoft.com/office/word/2012/wordml" xmlns:w16cex="http://schemas.microsoft.com/office/word/2018/wordml/cex" xmlns:w16cid="http://schemas.microsoft.com/office/word/2016/wordml/cid" xmlns:w16="http://schemas.microsoft.com/office/word/2018/wordml" xmlns:w16sdtdh="http://schemas.microsoft.com/office/word/2020/wordml/sdtdatahash" xmlns:w16se="http://schemas.microsoft.com/office/word/2015/wordml/symex" mc:Ignorable="w14 w15 w16se w16cid w16 w16cex w16sdtdh">
   <w:docDefaults>
     <w:rPrDefault>
       <w:rPr>
@@ -4311,7 +4289,7 @@
     </w:rPrDefault>
     <w:pPrDefault/>
   </w:docDefaults>
-  <w:latentStyles w:defLockedState="0" w:defUIPriority="99" w:defSemiHidden="0" w:defUnhideWhenUsed="0" w:defQFormat="0" w:count="375">
+  <w:latentStyles w:defLockedState="0" w:defUIPriority="99" w:defSemiHidden="0" w:defUnhideWhenUsed="0" w:defQFormat="0" w:count="376">
     <w:lsdException w:name="Normal" w:uiPriority="0" w:qFormat="1"/>
     <w:lsdException w:name="heading 1" w:uiPriority="9" w:qFormat="1"/>
     <w:lsdException w:name="heading 2" w:semiHidden="1" w:uiPriority="9" w:unhideWhenUsed="1" w:qFormat="1"/>
@@ -4417,7 +4395,6 @@
     <w:lsdException w:name="HTML Sample" w:semiHidden="1" w:unhideWhenUsed="1"/>
     <w:lsdException w:name="HTML Typewriter" w:semiHidden="1" w:unhideWhenUsed="1"/>
     <w:lsdException w:name="HTML Variable" w:semiHidden="1" w:unhideWhenUsed="1"/>
-    <w:lsdException w:name="Normal Table" w:semiHidden="1" w:unhideWhenUsed="1"/>
     <w:lsdException w:name="annotation subject" w:semiHidden="1" w:unhideWhenUsed="1"/>
     <w:lsdException w:name="No List" w:semiHidden="1" w:unhideWhenUsed="1"/>
     <w:lsdException w:name="Outline List 1" w:semiHidden="1" w:unhideWhenUsed="1"/>
@@ -4464,10 +4441,8 @@
     <w:lsdException w:name="Table Subtle 2" w:semiHidden="1" w:unhideWhenUsed="1"/>
     <w:lsdException w:name="Table Web 1" w:semiHidden="1" w:unhideWhenUsed="1"/>
     <w:lsdException w:name="Table Web 2" w:semiHidden="1" w:unhideWhenUsed="1"/>
-    <w:lsdException w:name="Table Web 3" w:semiHidden="1" w:unhideWhenUsed="1"/>
     <w:lsdException w:name="Balloon Text" w:semiHidden="1" w:unhideWhenUsed="1"/>
     <w:lsdException w:name="Table Grid" w:uiPriority="39"/>
-    <w:lsdException w:name="Table Theme" w:semiHidden="1" w:unhideWhenUsed="1"/>
     <w:lsdException w:name="Placeholder Text" w:semiHidden="1"/>
     <w:lsdException w:name="No Spacing" w:uiPriority="1" w:qFormat="1"/>
     <w:lsdException w:name="Light Shading" w:uiPriority="60"/>
@@ -4687,6 +4662,7 @@
     <w:lsdException w:name="Smart Hyperlink" w:semiHidden="1" w:unhideWhenUsed="1"/>
     <w:lsdException w:name="Hashtag" w:semiHidden="1" w:unhideWhenUsed="1"/>
     <w:lsdException w:name="Unresolved Mention" w:semiHidden="1" w:unhideWhenUsed="1"/>
+    <w:lsdException w:name="Smart Link" w:semiHidden="1" w:unhideWhenUsed="1"/>
   </w:latentStyles>
   <w:style w:type="paragraph" w:default="1" w:styleId="Normal">
     <w:name w:val="Normal"/>

</xml_diff>